<commit_message>
Actualizar documentación del proyecto para incluir detalles sobre la sincronización de tareas de Canvas a Notion y el envío de notificaciones por Telegram.
</commit_message>
<xml_diff>
--- a/Documentacion_Canvas_Notion_Sync.docx
+++ b/Documentacion_Canvas_Notion_Sync.docx
@@ -4,28 +4,20 @@
   <w:body>
     <w:p>
       <w:pPr>
-        <w:pStyle w:val="Title"/>
+        <w:pStyle w:val="Heading1"/>
       </w:pPr>
       <w:r>
-        <w:t>Canvas LMS to Notion Sync</w:t>
+        <w:t>Documentación: Canvas → Notion Sync</w:t>
       </w:r>
     </w:p>
     <w:p>
       <w:r>
-        <w:rPr>
-          <w:i/>
-        </w:rPr>
-        <w:t>Documentacion tecnica del proyecto</w:t>
+        <w:t>Proyecto de automatización para sincronizar tareas de Canvas LMS a una base de datos de Notion.</w:t>
       </w:r>
     </w:p>
     <w:p>
       <w:r>
-        <w:t>Fecha: 3 de abril de 2026</w:t>
-      </w:r>
-    </w:p>
-    <w:p>
-      <w:r>
-        <w:t>Proyecto: AutomatizarNotionCanvas</w:t>
+        <w:t>Autor: Julian | Fecha de actualización: Abril 2026</w:t>
       </w:r>
     </w:p>
     <w:p>
@@ -38,17 +30,12 @@
         <w:pStyle w:val="Heading1"/>
       </w:pPr>
       <w:r>
-        <w:t>1. Descripcion General</w:t>
+        <w:t>1. Descripción General</w:t>
       </w:r>
     </w:p>
     <w:p>
       <w:r>
-        <w:t>Este proyecto automatiza la sincronizacion de asignaciones universitarias (9no semestre) desde Canvas LMS hacia la base de datos "Tareas 9no" en Notion. El script se ejecuta manualmente bajo demanda y es idempotente: puede ejecutarse multiples veces sin crear duplicados.</w:t>
-      </w:r>
-    </w:p>
-    <w:p>
-      <w:r>
-        <w:t>Objetivo: Extraer asignaciones publicadas en Canvas con fecha limite dentro de la semana actual (lunes a domingo en hora Colombia UTC-5), y crear en Notion una entrada por cada tarea nueva, usando la URL de Canvas como identificador unico en el campo Descripcion.</w:t>
+        <w:t>Este proyecto automatiza la sincronización de tareas universitarias desde Canvas LMS hacia una base de datos en Notion llamada "Tareas 9no". El script consulta la API de Canvas, filtra las tareas de la semana actual (lunes a domingo en zona horaria Colombia UTC-5), verifica si ya existen en Notion para evitar duplicados, y crea las páginas nuevas con sus propiedades. Además, consulta el estado de entrega de cada tarea en Canvas para asignar automáticamente el estado correcto en Notion. Al finalizar, envía una notificación por Telegram si se agregaron tareas nuevas.</w:t>
       </w:r>
     </w:p>
     <w:p>
@@ -56,291 +43,92 @@
         <w:pStyle w:val="Heading1"/>
       </w:pPr>
       <w:r>
-        <w:t>2. Estructura del Proyecto</w:t>
-      </w:r>
-    </w:p>
-    <w:tbl>
-      <w:tblPr>
-        <w:tblStyle w:val="TableGrid"/>
-        <w:tblW w:type="auto" w:w="0"/>
-        <w:tblLook w:firstColumn="1" w:firstRow="1" w:lastColumn="0" w:lastRow="0" w:noHBand="0" w:noVBand="1" w:val="04A0"/>
-      </w:tblPr>
-      <w:tblGrid>
-        <w:gridCol w:w="4320"/>
-        <w:gridCol w:w="4320"/>
-      </w:tblGrid>
-      <w:tr>
-        <w:tc>
-          <w:tcPr>
-            <w:tcW w:type="dxa" w:w="4320"/>
-          </w:tcPr>
-          <w:p>
-            <w:r>
-              <w:rPr>
-                <w:b/>
-              </w:rPr>
-              <w:t>Archivo</w:t>
-            </w:r>
-          </w:p>
-        </w:tc>
-        <w:tc>
-          <w:tcPr>
-            <w:tcW w:type="dxa" w:w="4320"/>
-          </w:tcPr>
-          <w:p>
-            <w:r>
-              <w:rPr>
-                <w:b/>
-              </w:rPr>
-              <w:t>Proposito</w:t>
-            </w:r>
-          </w:p>
-        </w:tc>
-      </w:tr>
-      <w:tr>
-        <w:tc>
-          <w:tcPr>
-            <w:tcW w:type="dxa" w:w="4320"/>
-          </w:tcPr>
-          <w:p>
-            <w:r>
-              <w:t>.env</w:t>
-            </w:r>
-          </w:p>
-        </w:tc>
-        <w:tc>
-          <w:tcPr>
-            <w:tcW w:type="dxa" w:w="4320"/>
-          </w:tcPr>
-          <w:p>
-            <w:r>
-              <w:t>Credenciales reales (no versionado con git)</w:t>
-            </w:r>
-          </w:p>
-        </w:tc>
-      </w:tr>
-      <w:tr>
-        <w:tc>
-          <w:tcPr>
-            <w:tcW w:type="dxa" w:w="4320"/>
-          </w:tcPr>
-          <w:p>
-            <w:r>
-              <w:t>.env.example</w:t>
-            </w:r>
-          </w:p>
-        </w:tc>
-        <w:tc>
-          <w:tcPr>
-            <w:tcW w:type="dxa" w:w="4320"/>
-          </w:tcPr>
-          <w:p>
-            <w:r>
-              <w:t>Template de credenciales sin valores reales</w:t>
-            </w:r>
-          </w:p>
-        </w:tc>
-      </w:tr>
-      <w:tr>
-        <w:tc>
-          <w:tcPr>
-            <w:tcW w:type="dxa" w:w="4320"/>
-          </w:tcPr>
-          <w:p>
-            <w:r>
-              <w:t>.gitignore</w:t>
-            </w:r>
-          </w:p>
-        </w:tc>
-        <w:tc>
-          <w:tcPr>
-            <w:tcW w:type="dxa" w:w="4320"/>
-          </w:tcPr>
-          <w:p>
-            <w:r>
-              <w:t>Exclusiones de git: .env, __pycache__, logs, venvs</w:t>
-            </w:r>
-          </w:p>
-        </w:tc>
-      </w:tr>
-      <w:tr>
-        <w:tc>
-          <w:tcPr>
-            <w:tcW w:type="dxa" w:w="4320"/>
-          </w:tcPr>
-          <w:p>
-            <w:r>
-              <w:t>requirements.txt</w:t>
-            </w:r>
-          </w:p>
-        </w:tc>
-        <w:tc>
-          <w:tcPr>
-            <w:tcW w:type="dxa" w:w="4320"/>
-          </w:tcPr>
-          <w:p>
-            <w:r>
-              <w:t>Dependencias Python del proyecto</w:t>
-            </w:r>
-          </w:p>
-        </w:tc>
-      </w:tr>
-      <w:tr>
-        <w:tc>
-          <w:tcPr>
-            <w:tcW w:type="dxa" w:w="4320"/>
-          </w:tcPr>
-          <w:p>
-            <w:r>
-              <w:t>config.py</w:t>
-            </w:r>
-          </w:p>
-        </w:tc>
-        <w:tc>
-          <w:tcPr>
-            <w:tcW w:type="dxa" w:w="4320"/>
-          </w:tcPr>
-          <w:p>
-            <w:r>
-              <w:t>Carga de variables de entorno y mapeo de cursos</w:t>
-            </w:r>
-          </w:p>
-        </w:tc>
-      </w:tr>
-      <w:tr>
-        <w:tc>
-          <w:tcPr>
-            <w:tcW w:type="dxa" w:w="4320"/>
-          </w:tcPr>
-          <w:p>
-            <w:r>
-              <w:t>canvas_client.py</w:t>
-            </w:r>
-          </w:p>
-        </w:tc>
-        <w:tc>
-          <w:tcPr>
-            <w:tcW w:type="dxa" w:w="4320"/>
-          </w:tcPr>
-          <w:p>
-            <w:r>
-              <w:t>Cliente HTTP para la API de Canvas LMS</w:t>
-            </w:r>
-          </w:p>
-        </w:tc>
-      </w:tr>
-      <w:tr>
-        <w:tc>
-          <w:tcPr>
-            <w:tcW w:type="dxa" w:w="4320"/>
-          </w:tcPr>
-          <w:p>
-            <w:r>
-              <w:t>notion_client.py</w:t>
-            </w:r>
-          </w:p>
-        </w:tc>
-        <w:tc>
-          <w:tcPr>
-            <w:tcW w:type="dxa" w:w="4320"/>
-          </w:tcPr>
-          <w:p>
-            <w:r>
-              <w:t>Cliente HTTP para la API de Notion</w:t>
-            </w:r>
-          </w:p>
-        </w:tc>
-      </w:tr>
-      <w:tr>
-        <w:tc>
-          <w:tcPr>
-            <w:tcW w:type="dxa" w:w="4320"/>
-          </w:tcPr>
-          <w:p>
-            <w:r>
-              <w:t>sync.py</w:t>
-            </w:r>
-          </w:p>
-        </w:tc>
-        <w:tc>
-          <w:tcPr>
-            <w:tcW w:type="dxa" w:w="4320"/>
-          </w:tcPr>
-          <w:p>
-            <w:r>
-              <w:t>Logica de sincronizacion y transformacion de datos</w:t>
-            </w:r>
-          </w:p>
-        </w:tc>
-      </w:tr>
-      <w:tr>
-        <w:tc>
-          <w:tcPr>
-            <w:tcW w:type="dxa" w:w="4320"/>
-          </w:tcPr>
-          <w:p>
-            <w:r>
-              <w:t>main.py</w:t>
-            </w:r>
-          </w:p>
-        </w:tc>
-        <w:tc>
-          <w:tcPr>
-            <w:tcW w:type="dxa" w:w="4320"/>
-          </w:tcPr>
-          <w:p>
-            <w:r>
-              <w:t>Punto de entrada: logging, orquestacion y reporte</w:t>
-            </w:r>
-          </w:p>
-        </w:tc>
-      </w:tr>
-    </w:tbl>
-    <w:p/>
-    <w:p>
-      <w:pPr>
-        <w:pStyle w:val="Heading1"/>
-      </w:pPr>
-      <w:r>
-        <w:t>3. Dependencias</w:t>
+        <w:t>2. Arquitectura del Proyecto</w:t>
       </w:r>
     </w:p>
     <w:p>
       <w:r>
-        <w:t>Archivo requirements.txt:</w:t>
+        <w:t>El proyecto está compuesto por los siguientes archivos:</w:t>
       </w:r>
     </w:p>
     <w:p>
       <w:pPr>
-        <w:pStyle w:val="NoSpacing"/>
-        <w:ind w:left="576"/>
+        <w:pStyle w:val="ListBullet"/>
       </w:pPr>
       <w:r>
-        <w:rPr>
-          <w:rFonts w:ascii="Courier New" w:hAnsi="Courier New"/>
-          <w:color w:val="2E2E2E"/>
-          <w:sz w:val="18"/>
-        </w:rPr>
-        <w:t>requests&gt;=2.31.0</w:t>
+        <w:t>main.py: Punto de entrada. Configura logging, instancia clientes y orquesta la ejecución.</w:t>
       </w:r>
     </w:p>
     <w:p>
       <w:pPr>
-        <w:pStyle w:val="NoSpacing"/>
-        <w:ind w:left="576"/>
+        <w:pStyle w:val="ListBullet"/>
       </w:pPr>
       <w:r>
-        <w:rPr>
-          <w:rFonts w:ascii="Courier New" w:hAnsi="Courier New"/>
-          <w:color w:val="2E2E2E"/>
-          <w:sz w:val="18"/>
-        </w:rPr>
-        <w:t>python-dotenv&gt;=1.0.0</w:t>
+        <w:t>config.py: Carga variables de entorno y define el mapeo de cursos a materias.</w:t>
       </w:r>
     </w:p>
     <w:p>
+      <w:pPr>
+        <w:pStyle w:val="ListBullet"/>
+      </w:pPr>
       <w:r>
-        <w:t>Librerias estandar adicionales: datetime, logging, re, html, dataclasses.</w:t>
+        <w:t>canvas_client.py: Cliente HTTP para la API de Canvas con paginación, reintentos y consulta de submissions.</w:t>
+      </w:r>
+    </w:p>
+    <w:p>
+      <w:pPr>
+        <w:pStyle w:val="ListBullet"/>
+      </w:pPr>
+      <w:r>
+        <w:t>notion_client.py: Cliente HTTP para la API de Notion con throttling y reintentos en rate limit.</w:t>
+      </w:r>
+    </w:p>
+    <w:p>
+      <w:pPr>
+        <w:pStyle w:val="ListBullet"/>
+      </w:pPr>
+      <w:r>
+        <w:t>sync.py: Lógica de negocio: filtro semanal, deduplicación, construcción de propiedades y reporte.</w:t>
+      </w:r>
+    </w:p>
+    <w:p>
+      <w:pPr>
+        <w:pStyle w:val="ListBullet"/>
+      </w:pPr>
+      <w:r>
+        <w:t>telegram_notifier.py: Envío de notificaciones por Telegram cuando se agregan tareas nuevas.</w:t>
+      </w:r>
+    </w:p>
+    <w:p>
+      <w:pPr>
+        <w:pStyle w:val="ListBullet"/>
+      </w:pPr>
+      <w:r>
+        <w:t>.github/workflows/sync.yml: Workflow de GitHub Actions para automatizar la ejecución en la nube.</w:t>
+      </w:r>
+    </w:p>
+    <w:p>
+      <w:pPr>
+        <w:pStyle w:val="ListBullet"/>
+      </w:pPr>
+      <w:r>
+        <w:t>.env: Variables de entorno con credenciales reales (no se sube a GitHub).</w:t>
+      </w:r>
+    </w:p>
+    <w:p>
+      <w:pPr>
+        <w:pStyle w:val="ListBullet"/>
+      </w:pPr>
+      <w:r>
+        <w:t>.env.example: Plantilla de variables de entorno con valores de ejemplo.</w:t>
+      </w:r>
+    </w:p>
+    <w:p>
+      <w:pPr>
+        <w:pStyle w:val="ListBullet"/>
+      </w:pPr>
+      <w:r>
+        <w:t>requirements.txt: Dependencias del proyecto: requests, python-dotenv.</w:t>
       </w:r>
     </w:p>
     <w:p>
@@ -348,924 +136,136 @@
         <w:pStyle w:val="Heading1"/>
       </w:pPr>
       <w:r>
-        <w:t>4. Configuracion (.env)</w:t>
+        <w:t>3. Variables de Entorno</w:t>
       </w:r>
     </w:p>
     <w:p>
       <w:r>
-        <w:t>Crear un archivo .env en la raiz del proyecto con las siguientes variables:</w:t>
+        <w:t>El archivo .env debe contener las siguientes variables:</w:t>
       </w:r>
     </w:p>
     <w:p>
-      <w:pPr>
-        <w:pStyle w:val="NoSpacing"/>
-        <w:ind w:left="576"/>
-      </w:pPr>
+      <w:pPr/>
       <w:r>
         <w:rPr>
           <w:rFonts w:ascii="Courier New" w:hAnsi="Courier New"/>
-          <w:color w:val="2E2E2E"/>
+          <w:color w:val="2E75B6"/>
           <w:sz w:val="18"/>
         </w:rPr>
-        <w:t>CANVAS_API_TOKEN=&lt;token de Canvas&gt;</w:t>
-      </w:r>
-    </w:p>
-    <w:p>
-      <w:pPr>
-        <w:pStyle w:val="NoSpacing"/>
-        <w:ind w:left="576"/>
-      </w:pPr>
-      <w:r>
-        <w:rPr>
-          <w:rFonts w:ascii="Courier New" w:hAnsi="Courier New"/>
-          <w:color w:val="2E2E2E"/>
-          <w:sz w:val="18"/>
-        </w:rPr>
+        <w:t>CANVAS_API_TOKEN=tu_token_de_canvas</w:t>
+        <w:br/>
         <w:t>CANVAS_BASE_URL=https://umb.instructure.com/api/v1</w:t>
-      </w:r>
-    </w:p>
-    <w:p>
-      <w:pPr>
-        <w:pStyle w:val="NoSpacing"/>
-        <w:ind w:left="576"/>
-      </w:pPr>
-      <w:r>
-        <w:rPr>
-          <w:rFonts w:ascii="Courier New" w:hAnsi="Courier New"/>
-          <w:color w:val="2E2E2E"/>
-          <w:sz w:val="18"/>
-        </w:rPr>
-        <w:t>NOTION_API_TOKEN=&lt;token de Notion&gt;</w:t>
-      </w:r>
-    </w:p>
-    <w:p>
-      <w:pPr>
-        <w:pStyle w:val="NoSpacing"/>
-        <w:ind w:left="576"/>
-      </w:pPr>
-      <w:r>
-        <w:rPr>
-          <w:rFonts w:ascii="Courier New" w:hAnsi="Courier New"/>
-          <w:color w:val="2E2E2E"/>
-          <w:sz w:val="18"/>
-        </w:rPr>
-        <w:t>NOTION_DATABASE_ID=&lt;ID de la base de datos Notion&gt;</w:t>
-      </w:r>
-    </w:p>
-    <w:p/>
-    <w:p>
-      <w:pPr>
-        <w:pStyle w:val="Heading2"/>
-      </w:pPr>
-      <w:r>
-        <w:t>4.1 Mapeo de Cursos (config.py)</w:t>
+        <w:br/>
+        <w:t>NOTION_API_TOKEN=tu_token_de_notion</w:t>
+        <w:br/>
+        <w:t>NOTION_DATABASE_ID=id_de_tu_base_de_datos</w:t>
+        <w:br/>
+        <w:t>TELEGRAM_BOT_TOKEN=token_de_tu_bot</w:t>
+        <w:br/>
+        <w:t>TELEGRAM_CHAT_ID=tu_chat_id</w:t>
       </w:r>
     </w:p>
     <w:p>
       <w:r>
-        <w:t>Diccionario que relaciona substrings de los nombres reales de Canvas con los valores exactos del campo "Materia" en Notion (case-insensitive):</w:t>
+        <w:t>Estas mismas variables deben configurarse como Repository Secrets en GitHub para que el workflow funcione.</w:t>
       </w:r>
     </w:p>
-    <w:tbl>
-      <w:tblPr>
-        <w:tblStyle w:val="TableGrid"/>
-        <w:tblW w:type="auto" w:w="0"/>
-        <w:tblLook w:firstColumn="1" w:firstRow="1" w:lastColumn="0" w:lastRow="0" w:noHBand="0" w:noVBand="1" w:val="04A0"/>
-      </w:tblPr>
-      <w:tblGrid>
-        <w:gridCol w:w="2880"/>
-        <w:gridCol w:w="2880"/>
-        <w:gridCol w:w="2880"/>
-      </w:tblGrid>
-      <w:tr>
-        <w:tc>
-          <w:tcPr>
-            <w:tcW w:type="dxa" w:w="2880"/>
-          </w:tcPr>
-          <w:p>
-            <w:r>
-              <w:rPr>
-                <w:b/>
-              </w:rPr>
-              <w:t>Substring clave</w:t>
-            </w:r>
-          </w:p>
-        </w:tc>
-        <w:tc>
-          <w:tcPr>
-            <w:tcW w:type="dxa" w:w="2880"/>
-          </w:tcPr>
-          <w:p>
-            <w:r>
-              <w:rPr>
-                <w:b/>
-              </w:rPr>
-              <w:t>Materia en Notion</w:t>
-            </w:r>
-          </w:p>
-        </w:tc>
-        <w:tc>
-          <w:tcPr>
-            <w:tcW w:type="dxa" w:w="2880"/>
-          </w:tcPr>
-          <w:p>
-            <w:r>
-              <w:rPr>
-                <w:b/>
-              </w:rPr>
-              <w:t>Nombre real en Canvas</w:t>
-            </w:r>
-          </w:p>
-        </w:tc>
-      </w:tr>
-      <w:tr>
-        <w:tc>
-          <w:tcPr>
-            <w:tcW w:type="dxa" w:w="2880"/>
-          </w:tcPr>
-          <w:p>
-            <w:r>
-              <w:t>soft seg</w:t>
-            </w:r>
-          </w:p>
-        </w:tc>
-        <w:tc>
-          <w:tcPr>
-            <w:tcW w:type="dxa" w:w="2880"/>
-          </w:tcPr>
-          <w:p>
-            <w:r>
-              <w:t>Desarrollo del software seguro</w:t>
-            </w:r>
-          </w:p>
-        </w:tc>
-        <w:tc>
-          <w:tcPr>
-            <w:tcW w:type="dxa" w:w="2880"/>
-          </w:tcPr>
-          <w:p>
-            <w:r>
-              <w:t>DESARROLLO SOFT SEG.</w:t>
-            </w:r>
-          </w:p>
-        </w:tc>
-      </w:tr>
-      <w:tr>
-        <w:tc>
-          <w:tcPr>
-            <w:tcW w:type="dxa" w:w="2880"/>
-          </w:tcPr>
-          <w:p>
-            <w:r>
-              <w:t>estocastico</w:t>
-            </w:r>
-          </w:p>
-        </w:tc>
-        <w:tc>
-          <w:tcPr>
-            <w:tcW w:type="dxa" w:w="2880"/>
-          </w:tcPr>
-          <w:p>
-            <w:r>
-              <w:t>Modelo Estocastico</w:t>
-            </w:r>
-          </w:p>
-        </w:tc>
-        <w:tc>
-          <w:tcPr>
-            <w:tcW w:type="dxa" w:w="2880"/>
-          </w:tcPr>
-          <w:p>
-            <w:r>
-              <w:t>MODELAMIENTO ESTOCASTICO</w:t>
-            </w:r>
-          </w:p>
-        </w:tc>
-      </w:tr>
-      <w:tr>
-        <w:tc>
-          <w:tcPr>
-            <w:tcW w:type="dxa" w:w="2880"/>
-          </w:tcPr>
-          <w:p>
-            <w:r>
-              <w:t>interfaces</w:t>
-            </w:r>
-          </w:p>
-        </w:tc>
-        <w:tc>
-          <w:tcPr>
-            <w:tcW w:type="dxa" w:w="2880"/>
-          </w:tcPr>
-          <w:p>
-            <w:r>
-              <w:t>Diseno de interfaces</w:t>
-            </w:r>
-          </w:p>
-        </w:tc>
-        <w:tc>
-          <w:tcPr>
-            <w:tcW w:type="dxa" w:w="2880"/>
-          </w:tcPr>
-          <w:p>
-            <w:r>
-              <w:t>DISENO DE INTERFACES</w:t>
-            </w:r>
-          </w:p>
-        </w:tc>
-      </w:tr>
-      <w:tr>
-        <w:tc>
-          <w:tcPr>
-            <w:tcW w:type="dxa" w:w="2880"/>
-          </w:tcPr>
-          <w:p>
-            <w:r>
-              <w:t>nuevas tec</w:t>
-            </w:r>
-          </w:p>
-        </w:tc>
-        <w:tc>
-          <w:tcPr>
-            <w:tcW w:type="dxa" w:w="2880"/>
-          </w:tcPr>
-          <w:p>
-            <w:r>
-              <w:t>Nuevas tecnologias</w:t>
-            </w:r>
-          </w:p>
-        </w:tc>
-        <w:tc>
-          <w:tcPr>
-            <w:tcW w:type="dxa" w:w="2880"/>
-          </w:tcPr>
-          <w:p>
-            <w:r>
-              <w:t>NUEVAS TEC DESARR</w:t>
-            </w:r>
-          </w:p>
-        </w:tc>
-      </w:tr>
-      <w:tr>
-        <w:tc>
-          <w:tcPr>
-            <w:tcW w:type="dxa" w:w="2880"/>
-          </w:tcPr>
-          <w:p>
-            <w:r>
-              <w:t>proyecto de inv</w:t>
-            </w:r>
-          </w:p>
-        </w:tc>
-        <w:tc>
-          <w:tcPr>
-            <w:tcW w:type="dxa" w:w="2880"/>
-          </w:tcPr>
-          <w:p>
-            <w:r>
-              <w:t>Proyecto 2</w:t>
-            </w:r>
-          </w:p>
-        </w:tc>
-        <w:tc>
-          <w:tcPr>
-            <w:tcW w:type="dxa" w:w="2880"/>
-          </w:tcPr>
-          <w:p>
-            <w:r>
-              <w:t>PROYECTO DE INV. II</w:t>
-            </w:r>
-          </w:p>
-        </w:tc>
-      </w:tr>
-      <w:tr>
-        <w:tc>
-          <w:tcPr>
-            <w:tcW w:type="dxa" w:w="2880"/>
-          </w:tcPr>
-          <w:p>
-            <w:r>
-              <w:t>ingenieria web</w:t>
-            </w:r>
-          </w:p>
-        </w:tc>
-        <w:tc>
-          <w:tcPr>
-            <w:tcW w:type="dxa" w:w="2880"/>
-          </w:tcPr>
-          <w:p>
-            <w:r>
-              <w:t>Web 2</w:t>
-            </w:r>
-          </w:p>
-        </w:tc>
-        <w:tc>
-          <w:tcPr>
-            <w:tcW w:type="dxa" w:w="2880"/>
-          </w:tcPr>
-          <w:p>
-            <w:r>
-              <w:t>INGENIERIA WEB II</w:t>
-            </w:r>
-          </w:p>
-        </w:tc>
-      </w:tr>
-      <w:tr>
-        <w:tc>
-          <w:tcPr>
-            <w:tcW w:type="dxa" w:w="2880"/>
-          </w:tcPr>
-          <w:p>
-            <w:r>
-              <w:t>sistemas expertos</w:t>
-            </w:r>
-          </w:p>
-        </w:tc>
-        <w:tc>
-          <w:tcPr>
-            <w:tcW w:type="dxa" w:w="2880"/>
-          </w:tcPr>
-          <w:p>
-            <w:r>
-              <w:t>Sistemas Expertos</w:t>
-            </w:r>
-          </w:p>
-        </w:tc>
-        <w:tc>
-          <w:tcPr>
-            <w:tcW w:type="dxa" w:w="2880"/>
-          </w:tcPr>
-          <w:p>
-            <w:r>
-              <w:t>SISTEMAS EXPERTOS</w:t>
-            </w:r>
-          </w:p>
-        </w:tc>
-      </w:tr>
-      <w:tr>
-        <w:tc>
-          <w:tcPr>
-            <w:tcW w:type="dxa" w:w="2880"/>
-          </w:tcPr>
-          <w:p>
-            <w:r>
-              <w:t>aplicabilidad</w:t>
-            </w:r>
-          </w:p>
-        </w:tc>
-        <w:tc>
-          <w:tcPr>
-            <w:tcW w:type="dxa" w:w="2880"/>
-          </w:tcPr>
-          <w:p>
-            <w:r>
-              <w:t>Aplicabilidad de IA</w:t>
-            </w:r>
-          </w:p>
-        </w:tc>
-        <w:tc>
-          <w:tcPr>
-            <w:tcW w:type="dxa" w:w="2880"/>
-          </w:tcPr>
-          <w:p>
-            <w:r>
-              <w:t>APLICABILIDAD DE LA INTEL</w:t>
-            </w:r>
-          </w:p>
-        </w:tc>
-      </w:tr>
-    </w:tbl>
-    <w:p/>
     <w:p>
       <w:pPr>
         <w:pStyle w:val="Heading1"/>
       </w:pPr>
       <w:r>
-        <w:t>5. Descripcion de Modulos</w:t>
+        <w:t>4. Mapeo de Cursos</w:t>
+      </w:r>
+    </w:p>
+    <w:p>
+      <w:r>
+        <w:t>En config.py se define el diccionario COURSE_TO_MATERIA que mapea substrings del nombre real del curso en Canvas al nombre de la materia en Notion:</w:t>
+      </w:r>
+    </w:p>
+    <w:p>
+      <w:pPr/>
+      <w:r>
+        <w:rPr>
+          <w:rFonts w:ascii="Courier New" w:hAnsi="Courier New"/>
+          <w:color w:val="2E75B6"/>
+          <w:sz w:val="18"/>
+        </w:rPr>
+        <w:t>COURSE_TO_MATERIA = {</w:t>
+        <w:br/>
+        <w:t xml:space="preserve">    "soft seg":          "Desarrollo del software seguro",</w:t>
+        <w:br/>
+        <w:t xml:space="preserve">    "estocastico":       "Modelo Estocastico",</w:t>
+        <w:br/>
+        <w:t xml:space="preserve">    "interfaces":        "Diseño de interfaces",</w:t>
+        <w:br/>
+        <w:t xml:space="preserve">    "nuevas tec":        "Nuevas tecnologias",</w:t>
+        <w:br/>
+        <w:t xml:space="preserve">    "proyecto de inv":   "Proyecto 2",</w:t>
+        <w:br/>
+        <w:t xml:space="preserve">    "ingenieria web":    "Web 2",</w:t>
+        <w:br/>
+        <w:t xml:space="preserve">    "sistemas expertos": "Sistemas Expertos",</w:t>
+        <w:br/>
+        <w:t xml:space="preserve">    "aplicabilidad":     "Aplicabilidad de IA",</w:t>
+        <w:br/>
+        <w:t>}</w:t>
       </w:r>
     </w:p>
     <w:p>
       <w:pPr>
-        <w:pStyle w:val="Heading2"/>
+        <w:pStyle w:val="Heading1"/>
       </w:pPr>
       <w:r>
-        <w:t>5.1 canvas_client.py</w:t>
+        <w:t>5. Filtro Semanal</w:t>
       </w:r>
     </w:p>
     <w:p>
       <w:r>
-        <w:t>Clase CanvasClient: cliente HTTP para la API REST de Canvas.</w:t>
+        <w:t>Solo se sincronizan tareas cuya fecha límite (due_at) esté entre el lunes 00:00 y el domingo 23:59 de la semana en curso, en zona horaria Colombia (UTC-5). Las tareas con fecha pasada o sin fecha son ignoradas.</w:t>
       </w:r>
     </w:p>
-    <w:tbl>
-      <w:tblPr>
-        <w:tblStyle w:val="TableGrid"/>
-        <w:tblW w:type="auto" w:w="0"/>
-        <w:tblLook w:firstColumn="1" w:firstRow="1" w:lastColumn="0" w:lastRow="0" w:noHBand="0" w:noVBand="1" w:val="04A0"/>
-      </w:tblPr>
-      <w:tblGrid>
-        <w:gridCol w:w="4320"/>
-        <w:gridCol w:w="4320"/>
-      </w:tblGrid>
-      <w:tr>
-        <w:tc>
-          <w:tcPr>
-            <w:tcW w:type="dxa" w:w="4320"/>
-          </w:tcPr>
-          <w:p>
-            <w:r>
-              <w:rPr>
-                <w:b/>
-              </w:rPr>
-              <w:t>Metodo</w:t>
-            </w:r>
-          </w:p>
-        </w:tc>
-        <w:tc>
-          <w:tcPr>
-            <w:tcW w:type="dxa" w:w="4320"/>
-          </w:tcPr>
-          <w:p>
-            <w:r>
-              <w:rPr>
-                <w:b/>
-              </w:rPr>
-              <w:t>Descripcion</w:t>
-            </w:r>
-          </w:p>
-        </w:tc>
-      </w:tr>
-      <w:tr>
-        <w:tc>
-          <w:tcPr>
-            <w:tcW w:type="dxa" w:w="4320"/>
-          </w:tcPr>
-          <w:p>
-            <w:r>
-              <w:t>__init__(base_url, token)</w:t>
-            </w:r>
-          </w:p>
-        </w:tc>
-        <w:tc>
-          <w:tcPr>
-            <w:tcW w:type="dxa" w:w="4320"/>
-          </w:tcPr>
-          <w:p>
-            <w:r>
-              <w:t>Inicializa requests.Session con header Authorization: Bearer.</w:t>
-            </w:r>
-          </w:p>
-        </w:tc>
-      </w:tr>
-      <w:tr>
-        <w:tc>
-          <w:tcPr>
-            <w:tcW w:type="dxa" w:w="4320"/>
-          </w:tcPr>
-          <w:p>
-            <w:r>
-              <w:t>_request_with_retry(url, params)</w:t>
-            </w:r>
-          </w:p>
-        </w:tc>
-        <w:tc>
-          <w:tcPr>
-            <w:tcW w:type="dxa" w:w="4320"/>
-          </w:tcPr>
-          <w:p>
-            <w:r>
-              <w:t>GET con reintentos: abort en 401/403, retry 3x con backoff exponencial en 5xx y timeouts.</w:t>
-            </w:r>
-          </w:p>
-        </w:tc>
-      </w:tr>
-      <w:tr>
-        <w:tc>
-          <w:tcPr>
-            <w:tcW w:type="dxa" w:w="4320"/>
-          </w:tcPr>
-          <w:p>
-            <w:r>
-              <w:t>_get_paginated(url, params)</w:t>
-            </w:r>
-          </w:p>
-        </w:tc>
-        <w:tc>
-          <w:tcPr>
-            <w:tcW w:type="dxa" w:w="4320"/>
-          </w:tcPr>
-          <w:p>
-            <w:r>
-              <w:t>Sigue headers Link rel="next" de Canvas hasta agotar todas las paginas.</w:t>
-            </w:r>
-          </w:p>
-        </w:tc>
-      </w:tr>
-      <w:tr>
-        <w:tc>
-          <w:tcPr>
-            <w:tcW w:type="dxa" w:w="4320"/>
-          </w:tcPr>
-          <w:p>
-            <w:r>
-              <w:t>get_active_courses()</w:t>
-            </w:r>
-          </w:p>
-        </w:tc>
-        <w:tc>
-          <w:tcPr>
-            <w:tcW w:type="dxa" w:w="4320"/>
-          </w:tcPr>
-          <w:p>
-            <w:r>
-              <w:t>Retorna todos los cursos activos del usuario (enrollment_state=active).</w:t>
-            </w:r>
-          </w:p>
-        </w:tc>
-      </w:tr>
-      <w:tr>
-        <w:tc>
-          <w:tcPr>
-            <w:tcW w:type="dxa" w:w="4320"/>
-          </w:tcPr>
-          <w:p>
-            <w:r>
-              <w:t>get_assignments(course_id)</w:t>
-            </w:r>
-          </w:p>
-        </w:tc>
-        <w:tc>
-          <w:tcPr>
-            <w:tcW w:type="dxa" w:w="4320"/>
-          </w:tcPr>
-          <w:p>
-            <w:r>
-              <w:t>Retorna asignaciones publicadas (workflow_state=published) de un curso.</w:t>
-            </w:r>
-          </w:p>
-        </w:tc>
-      </w:tr>
-    </w:tbl>
-    <w:p/>
+    <w:p>
+      <w:pPr/>
+      <w:r>
+        <w:rPr>
+          <w:rFonts w:ascii="Courier New" w:hAnsi="Courier New"/>
+          <w:color w:val="2E75B6"/>
+          <w:sz w:val="18"/>
+        </w:rPr>
+        <w:t>COLOMBIA_TZ = timezone(timedelta(hours=-5))</w:t>
+        <w:br/>
+        <w:br/>
+        <w:t>def is_due_this_week(due_at):</w:t>
+        <w:br/>
+        <w:t xml:space="preserve">    dt_col = datetime.fromisoformat(due_at.replace("Z", "+00:00")).astimezone(COLOMBIA_TZ)</w:t>
+        <w:br/>
+        <w:t xml:space="preserve">    now = datetime.now(COLOMBIA_TZ)</w:t>
+        <w:br/>
+        <w:t xml:space="preserve">    week_start, week_end = get_current_week_range()</w:t>
+        <w:br/>
+        <w:t xml:space="preserve">    return now &lt;= dt_col &lt;= week_end</w:t>
+      </w:r>
+    </w:p>
     <w:p>
       <w:pPr>
-        <w:pStyle w:val="Heading2"/>
+        <w:pStyle w:val="Heading1"/>
       </w:pPr>
       <w:r>
-        <w:t>5.2 notion_client.py</w:t>
+        <w:t>6. Deduplicación</w:t>
       </w:r>
     </w:p>
     <w:p>
       <w:r>
-        <w:t>Clase NotionClient: cliente HTTP para la API de Notion con throttling y retry.</w:t>
-      </w:r>
-    </w:p>
-    <w:tbl>
-      <w:tblPr>
-        <w:tblStyle w:val="TableGrid"/>
-        <w:tblW w:type="auto" w:w="0"/>
-        <w:tblLook w:firstColumn="1" w:firstRow="1" w:lastColumn="0" w:lastRow="0" w:noHBand="0" w:noVBand="1" w:val="04A0"/>
-      </w:tblPr>
-      <w:tblGrid>
-        <w:gridCol w:w="4320"/>
-        <w:gridCol w:w="4320"/>
-      </w:tblGrid>
-      <w:tr>
-        <w:tc>
-          <w:tcPr>
-            <w:tcW w:type="dxa" w:w="4320"/>
-          </w:tcPr>
-          <w:p>
-            <w:r>
-              <w:rPr>
-                <w:b/>
-              </w:rPr>
-              <w:t>Metodo</w:t>
-            </w:r>
-          </w:p>
-        </w:tc>
-        <w:tc>
-          <w:tcPr>
-            <w:tcW w:type="dxa" w:w="4320"/>
-          </w:tcPr>
-          <w:p>
-            <w:r>
-              <w:rPr>
-                <w:b/>
-              </w:rPr>
-              <w:t>Descripcion</w:t>
-            </w:r>
-          </w:p>
-        </w:tc>
-      </w:tr>
-      <w:tr>
-        <w:tc>
-          <w:tcPr>
-            <w:tcW w:type="dxa" w:w="4320"/>
-          </w:tcPr>
-          <w:p>
-            <w:r>
-              <w:t>__init__(token, database_id)</w:t>
-            </w:r>
-          </w:p>
-        </w:tc>
-        <w:tc>
-          <w:tcPr>
-            <w:tcW w:type="dxa" w:w="4320"/>
-          </w:tcPr>
-          <w:p>
-            <w:r>
-              <w:t>Inicializa sesion con headers Notion-Version: 2022-06-28.</w:t>
-            </w:r>
-          </w:p>
-        </w:tc>
-      </w:tr>
-      <w:tr>
-        <w:tc>
-          <w:tcPr>
-            <w:tcW w:type="dxa" w:w="4320"/>
-          </w:tcPr>
-          <w:p>
-            <w:r>
-              <w:t>_throttle()</w:t>
-            </w:r>
-          </w:p>
-        </w:tc>
-        <w:tc>
-          <w:tcPr>
-            <w:tcW w:type="dxa" w:w="4320"/>
-          </w:tcPr>
-          <w:p>
-            <w:r>
-              <w:t>Garantiza minimo 0.35s entre requests para respetar el rate limit de Notion.</w:t>
-            </w:r>
-          </w:p>
-        </w:tc>
-      </w:tr>
-      <w:tr>
-        <w:tc>
-          <w:tcPr>
-            <w:tcW w:type="dxa" w:w="4320"/>
-          </w:tcPr>
-          <w:p>
-            <w:r>
-              <w:t>_request(method, endpoint, json)</w:t>
-            </w:r>
-          </w:p>
-        </w:tc>
-        <w:tc>
-          <w:tcPr>
-            <w:tcW w:type="dxa" w:w="4320"/>
-          </w:tcPr>
-          <w:p>
-            <w:r>
-              <w:t>Retry hasta 5x en 429 (respeta Retry-After), log detallado en 400.</w:t>
-            </w:r>
-          </w:p>
-        </w:tc>
-      </w:tr>
-      <w:tr>
-        <w:tc>
-          <w:tcPr>
-            <w:tcW w:type="dxa" w:w="4320"/>
-          </w:tcPr>
-          <w:p>
-            <w:r>
-              <w:t>get_existing_titles()</w:t>
-            </w:r>
-          </w:p>
-        </w:tc>
-        <w:tc>
-          <w:tcPr>
-            <w:tcW w:type="dxa" w:w="4320"/>
-          </w:tcPr>
-          <w:p>
-            <w:r>
-              <w:t>Pagina la BD completa y retorna set[str] con todas las URLs existentes en Descripcion.</w:t>
-            </w:r>
-          </w:p>
-        </w:tc>
-      </w:tr>
-      <w:tr>
-        <w:tc>
-          <w:tcPr>
-            <w:tcW w:type="dxa" w:w="4320"/>
-          </w:tcPr>
-          <w:p>
-            <w:r>
-              <w:t>create_page(properties)</w:t>
-            </w:r>
-          </w:p>
-        </w:tc>
-        <w:tc>
-          <w:tcPr>
-            <w:tcW w:type="dxa" w:w="4320"/>
-          </w:tcPr>
-          <w:p>
-            <w:r>
-              <w:t>Crea una pagina nueva en la base de datos con el payload dado.</w:t>
-            </w:r>
-          </w:p>
-        </w:tc>
-      </w:tr>
-    </w:tbl>
-    <w:p/>
-    <w:p>
-      <w:pPr>
-        <w:pStyle w:val="Heading2"/>
-      </w:pPr>
-      <w:r>
-        <w:t>5.3 sync.py</w:t>
+        <w:t>Antes de crear una tarea en Notion, el script consulta todas las páginas existentes en la base de datos y extrae el campo "Descripción" (campo título). Este campo almacena el html_url de Canvas como enlace embebido en el texto del nombre de la tarea. La deduplicación compara el link.url del rich text, garantizando que no se creen duplicados aunque el nombre de la tarea cambie.</w:t>
       </w:r>
     </w:p>
     <w:p>
-      <w:r>
-        <w:t>Modulo de logica de negocio: transformacion, filtrado y orquestacion.</w:t>
-      </w:r>
-    </w:p>
-    <w:tbl>
-      <w:tblPr>
-        <w:tblStyle w:val="TableGrid"/>
-        <w:tblW w:type="auto" w:w="0"/>
-        <w:tblLook w:firstColumn="1" w:firstRow="1" w:lastColumn="0" w:lastRow="0" w:noHBand="0" w:noVBand="1" w:val="04A0"/>
-      </w:tblPr>
-      <w:tblGrid>
-        <w:gridCol w:w="4320"/>
-        <w:gridCol w:w="4320"/>
-      </w:tblGrid>
-      <w:tr>
-        <w:tc>
-          <w:tcPr>
-            <w:tcW w:type="dxa" w:w="4320"/>
-          </w:tcPr>
-          <w:p>
-            <w:r>
-              <w:rPr>
-                <w:b/>
-              </w:rPr>
-              <w:t>Funcion</w:t>
-            </w:r>
-          </w:p>
-        </w:tc>
-        <w:tc>
-          <w:tcPr>
-            <w:tcW w:type="dxa" w:w="4320"/>
-          </w:tcPr>
-          <w:p>
-            <w:r>
-              <w:rPr>
-                <w:b/>
-              </w:rPr>
-              <w:t>Descripcion</w:t>
-            </w:r>
-          </w:p>
-        </w:tc>
-      </w:tr>
-      <w:tr>
-        <w:tc>
-          <w:tcPr>
-            <w:tcW w:type="dxa" w:w="4320"/>
-          </w:tcPr>
-          <w:p>
-            <w:r>
-              <w:t>get_current_week_range()</w:t>
-            </w:r>
-          </w:p>
-        </w:tc>
-        <w:tc>
-          <w:tcPr>
-            <w:tcW w:type="dxa" w:w="4320"/>
-          </w:tcPr>
-          <w:p>
-            <w:r>
-              <w:t>Calcula lunes 00:00 a domingo 23:59 de la semana actual en hora Colombia (UTC-5).</w:t>
-            </w:r>
-          </w:p>
-        </w:tc>
-      </w:tr>
-      <w:tr>
-        <w:tc>
-          <w:tcPr>
-            <w:tcW w:type="dxa" w:w="4320"/>
-          </w:tcPr>
-          <w:p>
-            <w:r>
-              <w:t>is_due_this_week(due_at)</w:t>
-            </w:r>
-          </w:p>
-        </w:tc>
-        <w:tc>
-          <w:tcPr>
-            <w:tcW w:type="dxa" w:w="4320"/>
-          </w:tcPr>
-          <w:p>
-            <w:r>
-              <w:t>True si due_at existe y cae entre ahora y el domingo 23:59 de la semana actual.</w:t>
-            </w:r>
-          </w:p>
-        </w:tc>
-      </w:tr>
-      <w:tr>
-        <w:tc>
-          <w:tcPr>
-            <w:tcW w:type="dxa" w:w="4320"/>
-          </w:tcPr>
-          <w:p>
-            <w:r>
-              <w:t>convert_utc_to_colombia(iso_str)</w:t>
-            </w:r>
-          </w:p>
-        </w:tc>
-        <w:tc>
-          <w:tcPr>
-            <w:tcW w:type="dxa" w:w="4320"/>
-          </w:tcPr>
-          <w:p>
-            <w:r>
-              <w:t>Convierte fecha ISO UTC a UTC-5 (Colombia). Retorna None si la entrada es None.</w:t>
-            </w:r>
-          </w:p>
-        </w:tc>
-      </w:tr>
-      <w:tr>
-        <w:tc>
-          <w:tcPr>
-            <w:tcW w:type="dxa" w:w="4320"/>
-          </w:tcPr>
-          <w:p>
-            <w:r>
-              <w:t>map_course_to_materia(name, mapping)</w:t>
-            </w:r>
-          </w:p>
-        </w:tc>
-        <w:tc>
-          <w:tcPr>
-            <w:tcW w:type="dxa" w:w="4320"/>
-          </w:tcPr>
-          <w:p>
-            <w:r>
-              <w:t>Substring match case-insensitive del nombre del curso contra el mapeo.</w:t>
-            </w:r>
-          </w:p>
-        </w:tc>
-      </w:tr>
-      <w:tr>
-        <w:tc>
-          <w:tcPr>
-            <w:tcW w:type="dxa" w:w="4320"/>
-          </w:tcPr>
-          <w:p>
-            <w:r>
-              <w:t>build_notion_properties(assignment, materia)</w:t>
-            </w:r>
-          </w:p>
-        </w:tc>
-        <w:tc>
-          <w:tcPr>
-            <w:tcW w:type="dxa" w:w="4320"/>
-          </w:tcPr>
-          <w:p>
-            <w:r>
-              <w:t>Construye el payload para Notion usando html_url como Descripcion.</w:t>
-            </w:r>
-          </w:p>
-        </w:tc>
-      </w:tr>
-      <w:tr>
-        <w:tc>
-          <w:tcPr>
-            <w:tcW w:type="dxa" w:w="4320"/>
-          </w:tcPr>
-          <w:p>
-            <w:r>
-              <w:t>run_sync(canvas, notion, course_mapping)</w:t>
-            </w:r>
-          </w:p>
-        </w:tc>
-        <w:tc>
-          <w:tcPr>
-            <w:tcW w:type="dxa" w:w="4320"/>
-          </w:tcPr>
-          <w:p>
-            <w:r>
-              <w:t>Orquesta la sincronizacion completa y retorna un SyncReport.</w:t>
-            </w:r>
-          </w:p>
-        </w:tc>
-      </w:tr>
-    </w:tbl>
-    <w:p/>
-    <w:p>
       <w:pPr>
-        <w:pStyle w:val="Heading2"/>
+        <w:pStyle w:val="Heading1"/>
       </w:pPr>
       <w:r>
-        <w:t>5.4 main.py</w:t>
-      </w:r>
-    </w:p>
-    <w:p>
-      <w:r>
-        <w:t>Punto de entrada del script. Responsabilidades:</w:t>
+        <w:t>7. Propiedades Creadas en Notion</w:t>
       </w:r>
     </w:p>
     <w:p>
@@ -1273,7 +273,7 @@
         <w:pStyle w:val="ListBullet"/>
       </w:pPr>
       <w:r>
-        <w:t>Carga las variables de entorno desde .env usando python-dotenv.</w:t>
+        <w:t>Descripción (título): Nombre de la tarea como texto clickeable que enlaza al assignment en Canvas.</w:t>
       </w:r>
     </w:p>
     <w:p>
@@ -1281,7 +281,7 @@
         <w:pStyle w:val="ListBullet"/>
       </w:pPr>
       <w:r>
-        <w:t>Configura logging: salida simultanea a stdout y al archivo canvas_notion_sync.log.</w:t>
+        <w:t>Materia: Select con el nombre de la materia según el mapeo de cursos.</w:t>
       </w:r>
     </w:p>
     <w:p>
@@ -1289,7 +289,7 @@
         <w:pStyle w:val="ListBullet"/>
       </w:pPr>
       <w:r>
-        <w:t>Instancia CanvasClient y NotionClient con las credenciales cargadas.</w:t>
+        <w:t>Estado de tarea: "Listo" si la tarea ya fue entregada en Canvas, "Sin empezar" si no.</w:t>
       </w:r>
     </w:p>
     <w:p>
@@ -1297,7 +297,49 @@
         <w:pStyle w:val="ListBullet"/>
       </w:pPr>
       <w:r>
-        <w:t>Ejecuta run_sync() y captura el SyncReport resultante.</w:t>
+        <w:t>Fecha Limite: Fecha y hora límite convertida a zona horaria Colombia (UTC-5).</w:t>
+      </w:r>
+    </w:p>
+    <w:p>
+      <w:pPr>
+        <w:pStyle w:val="Heading1"/>
+      </w:pPr>
+      <w:r>
+        <w:t>8. Estado de Entrega desde Canvas</w:t>
+      </w:r>
+    </w:p>
+    <w:p>
+      <w:r>
+        <w:t>Para cada tarea que se va a crear en Notion, el script consulta el endpoint de submissions de Canvas para verificar si el estudiante ya entregó:</w:t>
+      </w:r>
+    </w:p>
+    <w:p>
+      <w:pPr/>
+      <w:r>
+        <w:rPr>
+          <w:rFonts w:ascii="Courier New" w:hAnsi="Courier New"/>
+          <w:color w:val="2E75B6"/>
+          <w:sz w:val="18"/>
+        </w:rPr>
+        <w:t>GET /courses/{course_id}/assignments/{assignment_id}/submissions/self</w:t>
+        <w:br/>
+        <w:br/>
+        <w:t># Si workflow_state == "submitted" → Estado de tarea: "Listo"</w:t>
+        <w:br/>
+        <w:t># Si no → Estado de tarea: "Sin empezar"</w:t>
+      </w:r>
+    </w:p>
+    <w:p>
+      <w:pPr>
+        <w:pStyle w:val="Heading1"/>
+      </w:pPr>
+      <w:r>
+        <w:t>9. Cliente Canvas (canvas_client.py)</w:t>
+      </w:r>
+    </w:p>
+    <w:p>
+      <w:r>
+        <w:t>Funcionalidades principales:</w:t>
       </w:r>
     </w:p>
     <w:p>
@@ -1305,750 +347,31 @@
         <w:pStyle w:val="ListBullet"/>
       </w:pPr>
       <w:r>
-        <w:t>Imprime en consola: tareas creadas, saltadas, errores y cursos sin mapeo.</w:t>
-      </w:r>
-    </w:p>
-    <w:p/>
-    <w:p>
-      <w:pPr>
-        <w:pStyle w:val="Heading1"/>
-      </w:pPr>
-      <w:r>
-        <w:t>6. Flujo de Ejecucion</w:t>
-      </w:r>
-    </w:p>
-    <w:tbl>
-      <w:tblPr>
-        <w:tblStyle w:val="TableGrid"/>
-        <w:tblW w:type="auto" w:w="0"/>
-        <w:tblLook w:firstColumn="1" w:firstRow="1" w:lastColumn="0" w:lastRow="0" w:noHBand="0" w:noVBand="1" w:val="04A0"/>
-      </w:tblPr>
-      <w:tblGrid>
-        <w:gridCol w:w="2880"/>
-        <w:gridCol w:w="2880"/>
-        <w:gridCol w:w="2880"/>
-      </w:tblGrid>
-      <w:tr>
-        <w:tc>
-          <w:tcPr>
-            <w:tcW w:type="dxa" w:w="2880"/>
-          </w:tcPr>
-          <w:p>
-            <w:r>
-              <w:rPr>
-                <w:b/>
-              </w:rPr>
-              <w:t>Paso</w:t>
-            </w:r>
-          </w:p>
-        </w:tc>
-        <w:tc>
-          <w:tcPr>
-            <w:tcW w:type="dxa" w:w="2880"/>
-          </w:tcPr>
-          <w:p>
-            <w:r>
-              <w:rPr>
-                <w:b/>
-              </w:rPr>
-              <w:t>Modulo</w:t>
-            </w:r>
-          </w:p>
-        </w:tc>
-        <w:tc>
-          <w:tcPr>
-            <w:tcW w:type="dxa" w:w="2880"/>
-          </w:tcPr>
-          <w:p>
-            <w:r>
-              <w:rPr>
-                <w:b/>
-              </w:rPr>
-              <w:t>Accion</w:t>
-            </w:r>
-          </w:p>
-        </w:tc>
-      </w:tr>
-      <w:tr>
-        <w:tc>
-          <w:tcPr>
-            <w:tcW w:type="dxa" w:w="2880"/>
-          </w:tcPr>
-          <w:p>
-            <w:r>
-              <w:t>1</w:t>
-            </w:r>
-          </w:p>
-        </w:tc>
-        <w:tc>
-          <w:tcPr>
-            <w:tcW w:type="dxa" w:w="2880"/>
-          </w:tcPr>
-          <w:p>
-            <w:r>
-              <w:t>main.py</w:t>
-            </w:r>
-          </w:p>
-        </w:tc>
-        <w:tc>
-          <w:tcPr>
-            <w:tcW w:type="dxa" w:w="2880"/>
-          </w:tcPr>
-          <w:p>
-            <w:r>
-              <w:t>Carga .env, configura logging, instancia clientes.</w:t>
-            </w:r>
-          </w:p>
-        </w:tc>
-      </w:tr>
-      <w:tr>
-        <w:tc>
-          <w:tcPr>
-            <w:tcW w:type="dxa" w:w="2880"/>
-          </w:tcPr>
-          <w:p>
-            <w:r>
-              <w:t>2</w:t>
-            </w:r>
-          </w:p>
-        </w:tc>
-        <w:tc>
-          <w:tcPr>
-            <w:tcW w:type="dxa" w:w="2880"/>
-          </w:tcPr>
-          <w:p>
-            <w:r>
-              <w:t>NotionClient</w:t>
-            </w:r>
-          </w:p>
-        </w:tc>
-        <w:tc>
-          <w:tcPr>
-            <w:tcW w:type="dxa" w:w="2880"/>
-          </w:tcPr>
-          <w:p>
-            <w:r>
-              <w:t>get_existing_titles(): obtiene URLs existentes en Descripcion como set[str].</w:t>
-            </w:r>
-          </w:p>
-        </w:tc>
-      </w:tr>
-      <w:tr>
-        <w:tc>
-          <w:tcPr>
-            <w:tcW w:type="dxa" w:w="2880"/>
-          </w:tcPr>
-          <w:p>
-            <w:r>
-              <w:t>3</w:t>
-            </w:r>
-          </w:p>
-        </w:tc>
-        <w:tc>
-          <w:tcPr>
-            <w:tcW w:type="dxa" w:w="2880"/>
-          </w:tcPr>
-          <w:p>
-            <w:r>
-              <w:t>CanvasClient</w:t>
-            </w:r>
-          </w:p>
-        </w:tc>
-        <w:tc>
-          <w:tcPr>
-            <w:tcW w:type="dxa" w:w="2880"/>
-          </w:tcPr>
-          <w:p>
-            <w:r>
-              <w:t>get_active_courses(): lista cursos activos del semestre.</w:t>
-            </w:r>
-          </w:p>
-        </w:tc>
-      </w:tr>
-      <w:tr>
-        <w:tc>
-          <w:tcPr>
-            <w:tcW w:type="dxa" w:w="2880"/>
-          </w:tcPr>
-          <w:p>
-            <w:r>
-              <w:t>4</w:t>
-            </w:r>
-          </w:p>
-        </w:tc>
-        <w:tc>
-          <w:tcPr>
-            <w:tcW w:type="dxa" w:w="2880"/>
-          </w:tcPr>
-          <w:p>
-            <w:r>
-              <w:t>sync.py</w:t>
-            </w:r>
-          </w:p>
-        </w:tc>
-        <w:tc>
-          <w:tcPr>
-            <w:tcW w:type="dxa" w:w="2880"/>
-          </w:tcPr>
-          <w:p>
-            <w:r>
-              <w:t>map_course_to_materia(): si no hay mapeo, skip con warning.</w:t>
-            </w:r>
-          </w:p>
-        </w:tc>
-      </w:tr>
-      <w:tr>
-        <w:tc>
-          <w:tcPr>
-            <w:tcW w:type="dxa" w:w="2880"/>
-          </w:tcPr>
-          <w:p>
-            <w:r>
-              <w:t>5</w:t>
-            </w:r>
-          </w:p>
-        </w:tc>
-        <w:tc>
-          <w:tcPr>
-            <w:tcW w:type="dxa" w:w="2880"/>
-          </w:tcPr>
-          <w:p>
-            <w:r>
-              <w:t>CanvasClient</w:t>
-            </w:r>
-          </w:p>
-        </w:tc>
-        <w:tc>
-          <w:tcPr>
-            <w:tcW w:type="dxa" w:w="2880"/>
-          </w:tcPr>
-          <w:p>
-            <w:r>
-              <w:t>get_assignments(course_id): obtiene asignaciones publicadas.</w:t>
-            </w:r>
-          </w:p>
-        </w:tc>
-      </w:tr>
-      <w:tr>
-        <w:tc>
-          <w:tcPr>
-            <w:tcW w:type="dxa" w:w="2880"/>
-          </w:tcPr>
-          <w:p>
-            <w:r>
-              <w:t>6</w:t>
-            </w:r>
-          </w:p>
-        </w:tc>
-        <w:tc>
-          <w:tcPr>
-            <w:tcW w:type="dxa" w:w="2880"/>
-          </w:tcPr>
-          <w:p>
-            <w:r>
-              <w:t>sync.py</w:t>
-            </w:r>
-          </w:p>
-        </w:tc>
-        <w:tc>
-          <w:tcPr>
-            <w:tcW w:type="dxa" w:w="2880"/>
-          </w:tcPr>
-          <w:p>
-            <w:r>
-              <w:t>is_due_this_week(): filtra solo las que vencen entre hoy y el domingo.</w:t>
-            </w:r>
-          </w:p>
-        </w:tc>
-      </w:tr>
-      <w:tr>
-        <w:tc>
-          <w:tcPr>
-            <w:tcW w:type="dxa" w:w="2880"/>
-          </w:tcPr>
-          <w:p>
-            <w:r>
-              <w:t>7</w:t>
-            </w:r>
-          </w:p>
-        </w:tc>
-        <w:tc>
-          <w:tcPr>
-            <w:tcW w:type="dxa" w:w="2880"/>
-          </w:tcPr>
-          <w:p>
-            <w:r>
-              <w:t>sync.py</w:t>
-            </w:r>
-          </w:p>
-        </w:tc>
-        <w:tc>
-          <w:tcPr>
-            <w:tcW w:type="dxa" w:w="2880"/>
-          </w:tcPr>
-          <w:p>
-            <w:r>
-              <w:t>Deduplicacion: si html_url ya existe en Notion, skip.</w:t>
-            </w:r>
-          </w:p>
-        </w:tc>
-      </w:tr>
-      <w:tr>
-        <w:tc>
-          <w:tcPr>
-            <w:tcW w:type="dxa" w:w="2880"/>
-          </w:tcPr>
-          <w:p>
-            <w:r>
-              <w:t>8</w:t>
-            </w:r>
-          </w:p>
-        </w:tc>
-        <w:tc>
-          <w:tcPr>
-            <w:tcW w:type="dxa" w:w="2880"/>
-          </w:tcPr>
-          <w:p>
-            <w:r>
-              <w:t>sync.py</w:t>
-            </w:r>
-          </w:p>
-        </w:tc>
-        <w:tc>
-          <w:tcPr>
-            <w:tcW w:type="dxa" w:w="2880"/>
-          </w:tcPr>
-          <w:p>
-            <w:r>
-              <w:t>build_notion_properties(): pone html_url en Descripcion y arma el payload.</w:t>
-            </w:r>
-          </w:p>
-        </w:tc>
-      </w:tr>
-      <w:tr>
-        <w:tc>
-          <w:tcPr>
-            <w:tcW w:type="dxa" w:w="2880"/>
-          </w:tcPr>
-          <w:p>
-            <w:r>
-              <w:t>9</w:t>
-            </w:r>
-          </w:p>
-        </w:tc>
-        <w:tc>
-          <w:tcPr>
-            <w:tcW w:type="dxa" w:w="2880"/>
-          </w:tcPr>
-          <w:p>
-            <w:r>
-              <w:t>NotionClient</w:t>
-            </w:r>
-          </w:p>
-        </w:tc>
-        <w:tc>
-          <w:tcPr>
-            <w:tcW w:type="dxa" w:w="2880"/>
-          </w:tcPr>
-          <w:p>
-            <w:r>
-              <w:t>create_page(): crea la pagina en la base de datos.</w:t>
-            </w:r>
-          </w:p>
-        </w:tc>
-      </w:tr>
-      <w:tr>
-        <w:tc>
-          <w:tcPr>
-            <w:tcW w:type="dxa" w:w="2880"/>
-          </w:tcPr>
-          <w:p>
-            <w:r>
-              <w:t>10</w:t>
-            </w:r>
-          </w:p>
-        </w:tc>
-        <w:tc>
-          <w:tcPr>
-            <w:tcW w:type="dxa" w:w="2880"/>
-          </w:tcPr>
-          <w:p>
-            <w:r>
-              <w:t>main.py</w:t>
-            </w:r>
-          </w:p>
-        </w:tc>
-        <w:tc>
-          <w:tcPr>
-            <w:tcW w:type="dxa" w:w="2880"/>
-          </w:tcPr>
-          <w:p>
-            <w:r>
-              <w:t>Imprime SyncReport y cierra el log.</w:t>
-            </w:r>
-          </w:p>
-        </w:tc>
-      </w:tr>
-    </w:tbl>
-    <w:p/>
-    <w:p>
-      <w:pPr>
-        <w:pStyle w:val="Heading1"/>
-      </w:pPr>
-      <w:r>
-        <w:t>7. Schema de Notion (Tareas 9no)</w:t>
-      </w:r>
-    </w:p>
-    <w:tbl>
-      <w:tblPr>
-        <w:tblStyle w:val="TableGrid"/>
-        <w:tblW w:type="auto" w:w="0"/>
-        <w:tblLook w:firstColumn="1" w:firstRow="1" w:lastColumn="0" w:lastRow="0" w:noHBand="0" w:noVBand="1" w:val="04A0"/>
-      </w:tblPr>
-      <w:tblGrid>
-        <w:gridCol w:w="2880"/>
-        <w:gridCol w:w="2880"/>
-        <w:gridCol w:w="2880"/>
-      </w:tblGrid>
-      <w:tr>
-        <w:tc>
-          <w:tcPr>
-            <w:tcW w:type="dxa" w:w="2880"/>
-          </w:tcPr>
-          <w:p>
-            <w:r>
-              <w:rPr>
-                <w:b/>
-              </w:rPr>
-              <w:t>Campo Notion</w:t>
-            </w:r>
-          </w:p>
-        </w:tc>
-        <w:tc>
-          <w:tcPr>
-            <w:tcW w:type="dxa" w:w="2880"/>
-          </w:tcPr>
-          <w:p>
-            <w:r>
-              <w:rPr>
-                <w:b/>
-              </w:rPr>
-              <w:t>Tipo API</w:t>
-            </w:r>
-          </w:p>
-        </w:tc>
-        <w:tc>
-          <w:tcPr>
-            <w:tcW w:type="dxa" w:w="2880"/>
-          </w:tcPr>
-          <w:p>
-            <w:r>
-              <w:rPr>
-                <w:b/>
-              </w:rPr>
-              <w:t>Valor / Origen</w:t>
-            </w:r>
-          </w:p>
-        </w:tc>
-      </w:tr>
-      <w:tr>
-        <w:tc>
-          <w:tcPr>
-            <w:tcW w:type="dxa" w:w="2880"/>
-          </w:tcPr>
-          <w:p>
-            <w:r>
-              <w:t>Descripcion</w:t>
-            </w:r>
-          </w:p>
-        </w:tc>
-        <w:tc>
-          <w:tcPr>
-            <w:tcW w:type="dxa" w:w="2880"/>
-          </w:tcPr>
-          <w:p>
-            <w:r>
-              <w:t>title</w:t>
-            </w:r>
-          </w:p>
-        </w:tc>
-        <w:tc>
-          <w:tcPr>
-            <w:tcW w:type="dxa" w:w="2880"/>
-          </w:tcPr>
-          <w:p>
-            <w:r>
-              <w:t>assignment.html_url (URL completa de Canvas)</w:t>
-            </w:r>
-          </w:p>
-        </w:tc>
-      </w:tr>
-      <w:tr>
-        <w:tc>
-          <w:tcPr>
-            <w:tcW w:type="dxa" w:w="2880"/>
-          </w:tcPr>
-          <w:p>
-            <w:r>
-              <w:t>Fecha Limite</w:t>
-            </w:r>
-          </w:p>
-        </w:tc>
-        <w:tc>
-          <w:tcPr>
-            <w:tcW w:type="dxa" w:w="2880"/>
-          </w:tcPr>
-          <w:p>
-            <w:r>
-              <w:t>date</w:t>
-            </w:r>
-          </w:p>
-        </w:tc>
-        <w:tc>
-          <w:tcPr>
-            <w:tcW w:type="dxa" w:w="2880"/>
-          </w:tcPr>
-          <w:p>
-            <w:r>
-              <w:t>assignment.due_at (UTC a UTC-5 Colombia)</w:t>
-            </w:r>
-          </w:p>
-        </w:tc>
-      </w:tr>
-      <w:tr>
-        <w:tc>
-          <w:tcPr>
-            <w:tcW w:type="dxa" w:w="2880"/>
-          </w:tcPr>
-          <w:p>
-            <w:r>
-              <w:t>Materia</w:t>
-            </w:r>
-          </w:p>
-        </w:tc>
-        <w:tc>
-          <w:tcPr>
-            <w:tcW w:type="dxa" w:w="2880"/>
-          </w:tcPr>
-          <w:p>
-            <w:r>
-              <w:t>select</w:t>
-            </w:r>
-          </w:p>
-        </w:tc>
-        <w:tc>
-          <w:tcPr>
-            <w:tcW w:type="dxa" w:w="2880"/>
-          </w:tcPr>
-          <w:p>
-            <w:r>
-              <w:t>Mapeo por substring del nombre del curso</w:t>
-            </w:r>
-          </w:p>
-        </w:tc>
-      </w:tr>
-      <w:tr>
-        <w:tc>
-          <w:tcPr>
-            <w:tcW w:type="dxa" w:w="2880"/>
-          </w:tcPr>
-          <w:p>
-            <w:r>
-              <w:t>Estado de tarea</w:t>
-            </w:r>
-          </w:p>
-        </w:tc>
-        <w:tc>
-          <w:tcPr>
-            <w:tcW w:type="dxa" w:w="2880"/>
-          </w:tcPr>
-          <w:p>
-            <w:r>
-              <w:t>status</w:t>
-            </w:r>
-          </w:p>
-        </w:tc>
-        <w:tc>
-          <w:tcPr>
-            <w:tcW w:type="dxa" w:w="2880"/>
-          </w:tcPr>
-          <w:p>
-            <w:r>
-              <w:t>Fijo: "Sin empezar"</w:t>
-            </w:r>
-          </w:p>
-        </w:tc>
-      </w:tr>
-      <w:tr>
-        <w:tc>
-          <w:tcPr>
-            <w:tcW w:type="dxa" w:w="2880"/>
-          </w:tcPr>
-          <w:p>
-            <w:r>
-              <w:t>Contexto</w:t>
-            </w:r>
-          </w:p>
-        </w:tc>
-        <w:tc>
-          <w:tcPr>
-            <w:tcW w:type="dxa" w:w="2880"/>
-          </w:tcPr>
-          <w:p>
-            <w:r>
-              <w:t>rich_text</w:t>
-            </w:r>
-          </w:p>
-        </w:tc>
-        <w:tc>
-          <w:tcPr>
-            <w:tcW w:type="dxa" w:w="2880"/>
-          </w:tcPr>
-          <w:p>
-            <w:r>
-              <w:t>Omitido (no se usa)</w:t>
-            </w:r>
-          </w:p>
-        </w:tc>
-      </w:tr>
-      <w:tr>
-        <w:tc>
-          <w:tcPr>
-            <w:tcW w:type="dxa" w:w="2880"/>
-          </w:tcPr>
-          <w:p>
-            <w:r>
-              <w:t>Fecha de inicio</w:t>
-            </w:r>
-          </w:p>
-        </w:tc>
-        <w:tc>
-          <w:tcPr>
-            <w:tcW w:type="dxa" w:w="2880"/>
-          </w:tcPr>
-          <w:p>
-            <w:r>
-              <w:t>date</w:t>
-            </w:r>
-          </w:p>
-        </w:tc>
-        <w:tc>
-          <w:tcPr>
-            <w:tcW w:type="dxa" w:w="2880"/>
-          </w:tcPr>
-          <w:p>
-            <w:r>
-              <w:t>Omitido (vacio)</w:t>
-            </w:r>
-          </w:p>
-        </w:tc>
-      </w:tr>
-      <w:tr>
-        <w:tc>
-          <w:tcPr>
-            <w:tcW w:type="dxa" w:w="2880"/>
-          </w:tcPr>
-          <w:p>
-            <w:r>
-              <w:t>URL</w:t>
-            </w:r>
-          </w:p>
-        </w:tc>
-        <w:tc>
-          <w:tcPr>
-            <w:tcW w:type="dxa" w:w="2880"/>
-          </w:tcPr>
-          <w:p>
-            <w:r>
-              <w:t>url</w:t>
-            </w:r>
-          </w:p>
-        </w:tc>
-        <w:tc>
-          <w:tcPr>
-            <w:tcW w:type="dxa" w:w="2880"/>
-          </w:tcPr>
-          <w:p>
-            <w:r>
-              <w:t>Omitido (campo reservado para uso manual)</w:t>
-            </w:r>
-          </w:p>
-        </w:tc>
-      </w:tr>
-      <w:tr>
-        <w:tc>
-          <w:tcPr>
-            <w:tcW w:type="dxa" w:w="2880"/>
-          </w:tcPr>
-          <w:p>
-            <w:r>
-              <w:t>Personas</w:t>
-            </w:r>
-          </w:p>
-        </w:tc>
-        <w:tc>
-          <w:tcPr>
-            <w:tcW w:type="dxa" w:w="2880"/>
-          </w:tcPr>
-          <w:p>
-            <w:r>
-              <w:t>person</w:t>
-            </w:r>
-          </w:p>
-        </w:tc>
-        <w:tc>
-          <w:tcPr>
-            <w:tcW w:type="dxa" w:w="2880"/>
-          </w:tcPr>
-          <w:p>
-            <w:r>
-              <w:t>Omitido (vacio)</w:t>
-            </w:r>
-          </w:p>
-        </w:tc>
-      </w:tr>
-      <w:tr>
-        <w:tc>
-          <w:tcPr>
-            <w:tcW w:type="dxa" w:w="2880"/>
-          </w:tcPr>
-          <w:p>
-            <w:r>
-              <w:t>Archivos</w:t>
-            </w:r>
-          </w:p>
-        </w:tc>
-        <w:tc>
-          <w:tcPr>
-            <w:tcW w:type="dxa" w:w="2880"/>
-          </w:tcPr>
-          <w:p>
-            <w:r>
-              <w:t>file</w:t>
-            </w:r>
-          </w:p>
-        </w:tc>
-        <w:tc>
-          <w:tcPr>
-            <w:tcW w:type="dxa" w:w="2880"/>
-          </w:tcPr>
-          <w:p>
-            <w:r>
-              <w:t>Omitido (vacio)</w:t>
-            </w:r>
-          </w:p>
-        </w:tc>
-      </w:tr>
-    </w:tbl>
-    <w:p/>
-    <w:p>
-      <w:r>
-        <w:t>IMPORTANTE: "Estado de tarea" usa el tipo {"status": {...}}, no {"select": {...}}. Usar el tipo incorrecto retorna error 400 de la API.</w:t>
+        <w:t>get_active_courses(): obtiene cursos con enrollment_state=active.</w:t>
       </w:r>
     </w:p>
     <w:p>
+      <w:pPr>
+        <w:pStyle w:val="ListBullet"/>
+      </w:pPr>
       <w:r>
-        <w:t>IMPORTANTE: El campo "URL" de la tabla Notion esta reservado para uso manual del usuario (links a documentos propios). No se escribe desde el script.</w:t>
+        <w:t>get_assignments(course_id): obtiene asignaciones publicadas (workflow_state=published) con paginación automática via Link header.</w:t>
+      </w:r>
+    </w:p>
+    <w:p>
+      <w:pPr>
+        <w:pStyle w:val="ListBullet"/>
+      </w:pPr>
+      <w:r>
+        <w:t>get_submission_state(course_id, assignment_id): consulta el estado de entrega del estudiante para una tarea.</w:t>
+      </w:r>
+    </w:p>
+    <w:p>
+      <w:pPr>
+        <w:pStyle w:val="ListBullet"/>
+      </w:pPr>
+      <w:r>
+        <w:t>_request_with_retry(): aborta en 401/403, reintenta hasta 3 veces con backoff exponencial en 5xx/timeout.</w:t>
       </w:r>
     </w:p>
     <w:p>
@@ -2056,162 +379,12 @@
         <w:pStyle w:val="Heading1"/>
       </w:pPr>
       <w:r>
-        <w:t>8. Deduplicacion</w:t>
+        <w:t>10. Cliente Notion (notion_client.py)</w:t>
       </w:r>
     </w:p>
     <w:p>
       <w:r>
-        <w:t>La clave unica de cada tarea es su URL de Canvas (html_url), que sigue el formato:</w:t>
-      </w:r>
-    </w:p>
-    <w:p>
-      <w:pPr>
-        <w:pStyle w:val="NoSpacing"/>
-        <w:ind w:left="576"/>
-      </w:pPr>
-      <w:r>
-        <w:rPr>
-          <w:rFonts w:ascii="Courier New" w:hAnsi="Courier New"/>
-          <w:color w:val="2E2E2E"/>
-          <w:sz w:val="18"/>
-        </w:rPr>
-        <w:t>https://umb.instructure.com/courses/{course_id}/assignments/{assignment_id}</w:t>
-      </w:r>
-    </w:p>
-    <w:p/>
-    <w:p>
-      <w:r>
-        <w:t>Al iniciar la sincronizacion, el script lee todos los titulos (campo Descripcion) existentes en Notion y los carga en un set[str]. Antes de crear cada tarea, verifica si su URL ya esta en ese set. Si existe, la salta silenciosamente.</w:t>
-      </w:r>
-    </w:p>
-    <w:p>
-      <w:r>
-        <w:t>Esto garantiza idempotencia: ejecutar el script multiples veces en el mismo dia no genera duplicados.</w:t>
-      </w:r>
-    </w:p>
-    <w:p/>
-    <w:p>
-      <w:pPr>
-        <w:pStyle w:val="Heading1"/>
-      </w:pPr>
-      <w:r>
-        <w:t>9. Filtro Semanal</w:t>
-      </w:r>
-    </w:p>
-    <w:p>
-      <w:r>
-        <w:t>Solo se sincronizan asignaciones cuya fecha limite (due_at) cae dentro de la semana actual en hora Colombia (UTC-5). El rango se calcula dinamicamente cada vez que se ejecuta el script:</w:t>
-      </w:r>
-    </w:p>
-    <w:tbl>
-      <w:tblPr>
-        <w:tblStyle w:val="TableGrid"/>
-        <w:tblW w:type="auto" w:w="0"/>
-        <w:tblLook w:firstColumn="1" w:firstRow="1" w:lastColumn="0" w:lastRow="0" w:noHBand="0" w:noVBand="1" w:val="04A0"/>
-      </w:tblPr>
-      <w:tblGrid>
-        <w:gridCol w:w="4320"/>
-        <w:gridCol w:w="4320"/>
-      </w:tblGrid>
-      <w:tr>
-        <w:tc>
-          <w:tcPr>
-            <w:tcW w:type="dxa" w:w="4320"/>
-          </w:tcPr>
-          <w:p>
-            <w:r>
-              <w:rPr>
-                <w:b/>
-              </w:rPr>
-              <w:t>Limite</w:t>
-            </w:r>
-          </w:p>
-        </w:tc>
-        <w:tc>
-          <w:tcPr>
-            <w:tcW w:type="dxa" w:w="4320"/>
-          </w:tcPr>
-          <w:p>
-            <w:r>
-              <w:rPr>
-                <w:b/>
-              </w:rPr>
-              <w:t>Valor</w:t>
-            </w:r>
-          </w:p>
-        </w:tc>
-      </w:tr>
-      <w:tr>
-        <w:tc>
-          <w:tcPr>
-            <w:tcW w:type="dxa" w:w="4320"/>
-          </w:tcPr>
-          <w:p>
-            <w:r>
-              <w:t>Inicio</w:t>
-            </w:r>
-          </w:p>
-        </w:tc>
-        <w:tc>
-          <w:tcPr>
-            <w:tcW w:type="dxa" w:w="4320"/>
-          </w:tcPr>
-          <w:p>
-            <w:r>
-              <w:t>Lunes de la semana actual a las 00:00:00 (hora Colombia)</w:t>
-            </w:r>
-          </w:p>
-        </w:tc>
-      </w:tr>
-      <w:tr>
-        <w:tc>
-          <w:tcPr>
-            <w:tcW w:type="dxa" w:w="4320"/>
-          </w:tcPr>
-          <w:p>
-            <w:r>
-              <w:t>Fin</w:t>
-            </w:r>
-          </w:p>
-        </w:tc>
-        <w:tc>
-          <w:tcPr>
-            <w:tcW w:type="dxa" w:w="4320"/>
-          </w:tcPr>
-          <w:p>
-            <w:r>
-              <w:t>Domingo de la semana actual a las 23:59:59 (hora Colombia)</w:t>
-            </w:r>
-          </w:p>
-        </w:tc>
-      </w:tr>
-      <w:tr>
-        <w:tc>
-          <w:tcPr>
-            <w:tcW w:type="dxa" w:w="4320"/>
-          </w:tcPr>
-          <w:p>
-            <w:r>
-              <w:t>Minimo</w:t>
-            </w:r>
-          </w:p>
-        </w:tc>
-        <w:tc>
-          <w:tcPr>
-            <w:tcW w:type="dxa" w:w="4320"/>
-          </w:tcPr>
-          <w:p>
-            <w:r>
-              <w:t>El momento actual (no se sincronizan tareas cuyo due_at ya paso)</w:t>
-            </w:r>
-          </w:p>
-        </w:tc>
-      </w:tr>
-    </w:tbl>
-    <w:p/>
-    <w:p>
-      <w:r>
-        <w:t>Asignaciones excluidas por el filtro:</w:t>
+        <w:t>Funcionalidades principales:</w:t>
       </w:r>
     </w:p>
     <w:p>
@@ -2219,7 +392,7 @@
         <w:pStyle w:val="ListBullet"/>
       </w:pPr>
       <w:r>
-        <w:t>Sin due_at (fecha vacia): siempre excluidas.</w:t>
+        <w:t>get_existing_titles(): pagina toda la DB y retorna set de URLs (extraídas del link embebido en el título).</w:t>
       </w:r>
     </w:p>
     <w:p>
@@ -2227,7 +400,7 @@
         <w:pStyle w:val="ListBullet"/>
       </w:pPr>
       <w:r>
-        <w:t>due_at anterior al momento actual: ya vencieron.</w:t>
+        <w:t>create_page(properties): crea una página nueva en la base de datos.</w:t>
       </w:r>
     </w:p>
     <w:p>
@@ -2235,634 +408,241 @@
         <w:pStyle w:val="ListBullet"/>
       </w:pPr>
       <w:r>
-        <w:t>due_at posterior al domingo de la semana en curso: aun no corresponden.</w:t>
+        <w:t>_throttle(): espera 0.35s entre requests para no superar el rate limit de Notion.</w:t>
       </w:r>
     </w:p>
-    <w:p/>
+    <w:p>
+      <w:pPr>
+        <w:pStyle w:val="ListBullet"/>
+      </w:pPr>
+      <w:r>
+        <w:t>_request(): reintenta hasta 5 veces en 429 usando el header Retry-After.</w:t>
+      </w:r>
+    </w:p>
     <w:p>
       <w:pPr>
         <w:pStyle w:val="Heading1"/>
       </w:pPr>
       <w:r>
-        <w:t>10. Manejo de Errores</w:t>
+        <w:t>11. Notificaciones por Telegram</w:t>
       </w:r>
     </w:p>
-    <w:tbl>
-      <w:tblPr>
-        <w:tblStyle w:val="TableGrid"/>
-        <w:tblW w:type="auto" w:w="0"/>
-        <w:tblLook w:firstColumn="1" w:firstRow="1" w:lastColumn="0" w:lastRow="0" w:noHBand="0" w:noVBand="1" w:val="04A0"/>
-      </w:tblPr>
-      <w:tblGrid>
-        <w:gridCol w:w="4320"/>
-        <w:gridCol w:w="4320"/>
-      </w:tblGrid>
-      <w:tr>
-        <w:tc>
-          <w:tcPr>
-            <w:tcW w:type="dxa" w:w="4320"/>
-          </w:tcPr>
-          <w:p>
-            <w:r>
-              <w:rPr>
-                <w:b/>
-              </w:rPr>
-              <w:t>Escenario</w:t>
-            </w:r>
-          </w:p>
-        </w:tc>
-        <w:tc>
-          <w:tcPr>
-            <w:tcW w:type="dxa" w:w="4320"/>
-          </w:tcPr>
-          <w:p>
-            <w:r>
-              <w:rPr>
-                <w:b/>
-              </w:rPr>
-              <w:t>Accion</w:t>
-            </w:r>
-          </w:p>
-        </w:tc>
-      </w:tr>
-      <w:tr>
-        <w:tc>
-          <w:tcPr>
-            <w:tcW w:type="dxa" w:w="4320"/>
-          </w:tcPr>
-          <w:p>
-            <w:r>
-              <w:t>Canvas 401/403</w:t>
-            </w:r>
-          </w:p>
-        </w:tc>
-        <w:tc>
-          <w:tcPr>
-            <w:tcW w:type="dxa" w:w="4320"/>
-          </w:tcPr>
-          <w:p>
-            <w:r>
-              <w:t>Fatal: aborta el script con mensaje claro.</w:t>
-            </w:r>
-          </w:p>
-        </w:tc>
-      </w:tr>
-      <w:tr>
-        <w:tc>
-          <w:tcPr>
-            <w:tcW w:type="dxa" w:w="4320"/>
-          </w:tcPr>
-          <w:p>
-            <w:r>
-              <w:t>Canvas 5xx / Timeout</w:t>
-            </w:r>
-          </w:p>
-        </w:tc>
-        <w:tc>
-          <w:tcPr>
-            <w:tcW w:type="dxa" w:w="4320"/>
-          </w:tcPr>
-          <w:p>
-            <w:r>
-              <w:t>Retry 3x con backoff exponencial (2s, 4s, 8s).</w:t>
-            </w:r>
-          </w:p>
-        </w:tc>
-      </w:tr>
-      <w:tr>
-        <w:tc>
-          <w:tcPr>
-            <w:tcW w:type="dxa" w:w="4320"/>
-          </w:tcPr>
-          <w:p>
-            <w:r>
-              <w:t>Notion 429</w:t>
-            </w:r>
-          </w:p>
-        </w:tc>
-        <w:tc>
-          <w:tcPr>
-            <w:tcW w:type="dxa" w:w="4320"/>
-          </w:tcPr>
-          <w:p>
-            <w:r>
-              <w:t>Lee Retry-After, espera, reintenta hasta 5x.</w:t>
-            </w:r>
-          </w:p>
-        </w:tc>
-      </w:tr>
-      <w:tr>
-        <w:tc>
-          <w:tcPr>
-            <w:tcW w:type="dxa" w:w="4320"/>
-          </w:tcPr>
-          <w:p>
-            <w:r>
-              <w:t>Notion 400</w:t>
-            </w:r>
-          </w:p>
-        </w:tc>
-        <w:tc>
-          <w:tcPr>
-            <w:tcW w:type="dxa" w:w="4320"/>
-          </w:tcPr>
-          <w:p>
-            <w:r>
-              <w:t>Log del error y del body enviado, skip de la asignacion.</w:t>
-            </w:r>
-          </w:p>
-        </w:tc>
-      </w:tr>
-      <w:tr>
-        <w:tc>
-          <w:tcPr>
-            <w:tcW w:type="dxa" w:w="4320"/>
-          </w:tcPr>
-          <w:p>
-            <w:r>
-              <w:t>due_at null</w:t>
-            </w:r>
-          </w:p>
-        </w:tc>
-        <w:tc>
-          <w:tcPr>
-            <w:tcW w:type="dxa" w:w="4320"/>
-          </w:tcPr>
-          <w:p>
-            <w:r>
-              <w:t>La asignacion es filtrada por is_due_this_week() y no se crea.</w:t>
-            </w:r>
-          </w:p>
-        </w:tc>
-      </w:tr>
-      <w:tr>
-        <w:tc>
-          <w:tcPr>
-            <w:tcW w:type="dxa" w:w="4320"/>
-          </w:tcPr>
-          <w:p>
-            <w:r>
-              <w:t>Curso sin mapeo</w:t>
-            </w:r>
-          </w:p>
-        </w:tc>
-        <w:tc>
-          <w:tcPr>
-            <w:tcW w:type="dxa" w:w="4320"/>
-          </w:tcPr>
-          <w:p>
-            <w:r>
-              <w:t>Log warning, se salta el curso completo.</w:t>
-            </w:r>
-          </w:p>
-        </w:tc>
-      </w:tr>
-      <w:tr>
-        <w:tc>
-          <w:tcPr>
-            <w:tcW w:type="dxa" w:w="4320"/>
-          </w:tcPr>
-          <w:p>
-            <w:r>
-              <w:t>html_url vacio</w:t>
-            </w:r>
-          </w:p>
-        </w:tc>
-        <w:tc>
-          <w:tcPr>
-            <w:tcW w:type="dxa" w:w="4320"/>
-          </w:tcPr>
-          <w:p>
-            <w:r>
-              <w:t>Skip de la asignacion con log warning.</w:t>
-            </w:r>
-          </w:p>
-        </w:tc>
-      </w:tr>
-      <w:tr>
-        <w:tc>
-          <w:tcPr>
-            <w:tcW w:type="dxa" w:w="4320"/>
-          </w:tcPr>
-          <w:p>
-            <w:r>
-              <w:t>URL duplicada</w:t>
-            </w:r>
-          </w:p>
-        </w:tc>
-        <w:tc>
-          <w:tcPr>
-            <w:tcW w:type="dxa" w:w="4320"/>
-          </w:tcPr>
-          <w:p>
-            <w:r>
-              <w:t>Skip silencioso: ya existe en Notion.</w:t>
-            </w:r>
-          </w:p>
-        </w:tc>
-      </w:tr>
-    </w:tbl>
-    <w:p/>
+    <w:p>
+      <w:r>
+        <w:t>Al finalizar la sincronización, si se crearon tareas nuevas, se envía un mensaje al chat configurado con el detalle de cada tarea agregada:</w:t>
+      </w:r>
+    </w:p>
+    <w:p>
+      <w:pPr/>
+      <w:r>
+        <w:rPr>
+          <w:rFonts w:ascii="Courier New" w:hAnsi="Courier New"/>
+          <w:color w:val="2E75B6"/>
+          <w:sz w:val="18"/>
+        </w:rPr>
+        <w:t>Canvas → Notion Sync</w:t>
+        <w:br/>
+        <w:t>✅ 2 tarea(s) nueva(s):</w:t>
+        <w:br/>
+        <w:br/>
+        <w:t>📚 Web 2</w:t>
+        <w:br/>
+        <w:t>📝 Actividad de comparacion 5 TA:INGENIERÍA_WEBII_05</w:t>
+        <w:br/>
+        <w:t>📅 06/04/2026 11:59 PM</w:t>
+        <w:br/>
+        <w:br/>
+        <w:t>📚 Modelo Estocastico</w:t>
+        <w:br/>
+        <w:t>📝 Taller 3</w:t>
+        <w:br/>
+        <w:t>📅 07/04/2026 11:59 PM</w:t>
+      </w:r>
+    </w:p>
+    <w:p>
+      <w:r>
+        <w:t>Si no se crearon tareas nuevas (created == 0), no se envía ningún mensaje.</w:t>
+      </w:r>
+    </w:p>
     <w:p>
       <w:pPr>
         <w:pStyle w:val="Heading1"/>
       </w:pPr>
       <w:r>
-        <w:t>11. Como Ejecutar el Script</w:t>
+        <w:t>12. Automatización con GitHub Actions</w:t>
+      </w:r>
+    </w:p>
+    <w:p>
+      <w:r>
+        <w:t>El archivo .github/workflows/sync.yml define el workflow que ejecuta el script automáticamente en la nube sin depender del PC local.</w:t>
+      </w:r>
+    </w:p>
+    <w:p>
+      <w:r>
+        <w:t>Horario de ejecución (cron):</w:t>
       </w:r>
     </w:p>
     <w:p>
       <w:pPr>
-        <w:pStyle w:val="ListNumber"/>
+        <w:pStyle w:val="ListBullet"/>
       </w:pPr>
       <w:r>
-        <w:t>1. Crear el archivo .env con los tokens reales (copiar desde .env.example).</w:t>
+        <w:t>Lunes a viernes: cada 2 horas entre 12am y 10pm hora Colombia.</w:t>
       </w:r>
     </w:p>
     <w:p>
       <w:pPr>
-        <w:pStyle w:val="ListNumber"/>
+        <w:pStyle w:val="ListBullet"/>
       </w:pPr>
       <w:r>
-        <w:t>2. Instalar dependencias:   pip install -r requirements.txt</w:t>
+        <w:t>Domingo 10pm Colombia (= lunes 3am UTC).</w:t>
       </w:r>
     </w:p>
     <w:p>
       <w:pPr>
-        <w:pStyle w:val="ListNumber"/>
+        <w:pStyle w:val="ListBullet"/>
       </w:pPr>
       <w:r>
-        <w:t>3. Ejecutar el script:      python main.py</w:t>
+        <w:t>Sábado: sin ejecución.</w:t>
+      </w:r>
+    </w:p>
+    <w:p>
+      <w:r>
+        <w:t>También se puede ejecutar manualmente desde la pestaña Actions de GitHub con el botón "Run workflow".</w:t>
+      </w:r>
+    </w:p>
+    <w:p>
+      <w:r>
+        <w:t>Los secrets configurados en el repositorio son:</w:t>
       </w:r>
     </w:p>
     <w:p>
       <w:pPr>
-        <w:pStyle w:val="ListNumber"/>
+        <w:pStyle w:val="ListBullet"/>
       </w:pPr>
       <w:r>
-        <w:t>4. Revisar el reporte impreso en consola.</w:t>
+        <w:t>CANVAS_API_TOKEN</w:t>
       </w:r>
     </w:p>
     <w:p>
       <w:pPr>
-        <w:pStyle w:val="ListNumber"/>
+        <w:pStyle w:val="ListBullet"/>
       </w:pPr>
       <w:r>
-        <w:t>5. Verificar en Notion que las tareas nuevas aparecen con la URL de Canvas en Descripcion.</w:t>
+        <w:t>CANVAS_BASE_URL</w:t>
       </w:r>
     </w:p>
     <w:p>
       <w:pPr>
-        <w:pStyle w:val="ListNumber"/>
+        <w:pStyle w:val="ListBullet"/>
       </w:pPr>
       <w:r>
-        <w:t>6. Segunda ejecucion: debe reportar 0 tareas creadas (idempotencia).</w:t>
+        <w:t>NOTION_API_TOKEN</w:t>
       </w:r>
     </w:p>
     <w:p>
       <w:pPr>
-        <w:pStyle w:val="ListNumber"/>
+        <w:pStyle w:val="ListBullet"/>
       </w:pPr>
       <w:r>
-        <w:t>7. Revisar el log en:       canvas_notion_sync.log</w:t>
-      </w:r>
-    </w:p>
-    <w:p/>
-    <w:p>
-      <w:pPr>
-        <w:pStyle w:val="Heading2"/>
-      </w:pPr>
-      <w:r>
-        <w:t>11.1 Ejemplo de Salida en Consola</w:t>
+        <w:t>NOTION_DATABASE_ID</w:t>
       </w:r>
     </w:p>
     <w:p>
       <w:pPr>
-        <w:pStyle w:val="NoSpacing"/>
-        <w:ind w:left="576"/>
+        <w:pStyle w:val="ListBullet"/>
       </w:pPr>
       <w:r>
-        <w:rPr>
-          <w:rFonts w:ascii="Courier New" w:hAnsi="Courier New"/>
-          <w:color w:val="2E2E2E"/>
-          <w:sz w:val="18"/>
-        </w:rPr>
-        <w:t>--- Reporte de sincronizacion ---</w:t>
+        <w:t>TELEGRAM_BOT_TOKEN</w:t>
       </w:r>
     </w:p>
     <w:p>
       <w:pPr>
-        <w:pStyle w:val="NoSpacing"/>
-        <w:ind w:left="576"/>
+        <w:pStyle w:val="ListBullet"/>
       </w:pPr>
       <w:r>
-        <w:rPr>
-          <w:rFonts w:ascii="Courier New" w:hAnsi="Courier New"/>
-          <w:color w:val="2E2E2E"/>
-          <w:sz w:val="18"/>
-        </w:rPr>
-        <w:t xml:space="preserve">  Tareas creadas:  3</w:t>
+        <w:t>TELEGRAM_CHAT_ID</w:t>
       </w:r>
     </w:p>
-    <w:p>
-      <w:pPr>
-        <w:pStyle w:val="NoSpacing"/>
-        <w:ind w:left="576"/>
-      </w:pPr>
-      <w:r>
-        <w:rPr>
-          <w:rFonts w:ascii="Courier New" w:hAnsi="Courier New"/>
-          <w:color w:val="2E2E2E"/>
-          <w:sz w:val="18"/>
-        </w:rPr>
-        <w:t xml:space="preserve">  Tareas saltadas: 12</w:t>
-      </w:r>
-    </w:p>
-    <w:p>
-      <w:pPr>
-        <w:pStyle w:val="NoSpacing"/>
-        <w:ind w:left="576"/>
-      </w:pPr>
-      <w:r>
-        <w:rPr>
-          <w:rFonts w:ascii="Courier New" w:hAnsi="Courier New"/>
-          <w:color w:val="2E2E2E"/>
-          <w:sz w:val="18"/>
-        </w:rPr>
-        <w:t xml:space="preserve">  Errores:         0</w:t>
-      </w:r>
-    </w:p>
-    <w:p>
-      <w:pPr>
-        <w:pStyle w:val="NoSpacing"/>
-        <w:ind w:left="576"/>
-      </w:pPr>
-      <w:r>
-        <w:rPr>
-          <w:rFonts w:ascii="Courier New" w:hAnsi="Courier New"/>
-          <w:color w:val="2E2E2E"/>
-          <w:sz w:val="18"/>
-        </w:rPr>
-        <w:t xml:space="preserve">  Cursos sin mapeo (2):</w:t>
-      </w:r>
-    </w:p>
-    <w:p>
-      <w:pPr>
-        <w:pStyle w:val="NoSpacing"/>
-        <w:ind w:left="576"/>
-      </w:pPr>
-      <w:r>
-        <w:rPr>
-          <w:rFonts w:ascii="Courier New" w:hAnsi="Courier New"/>
-          <w:color w:val="2E2E2E"/>
-          <w:sz w:val="18"/>
-        </w:rPr>
-        <w:t xml:space="preserve">    - Comunicaciones Software</w:t>
-      </w:r>
-    </w:p>
-    <w:p>
-      <w:pPr>
-        <w:pStyle w:val="NoSpacing"/>
-        <w:ind w:left="576"/>
-      </w:pPr>
-      <w:r>
-        <w:rPr>
-          <w:rFonts w:ascii="Courier New" w:hAnsi="Courier New"/>
-          <w:color w:val="2E2E2E"/>
-          <w:sz w:val="18"/>
-        </w:rPr>
-        <w:t xml:space="preserve">    - MATEMATICAS DISCRETAS</w:t>
-      </w:r>
-    </w:p>
-    <w:p>
-      <w:pPr>
-        <w:pStyle w:val="NoSpacing"/>
-        <w:ind w:left="576"/>
-      </w:pPr>
-      <w:r>
-        <w:rPr>
-          <w:rFonts w:ascii="Courier New" w:hAnsi="Courier New"/>
-          <w:color w:val="2E2E2E"/>
-          <w:sz w:val="18"/>
-        </w:rPr>
-      </w:r>
-    </w:p>
-    <w:p>
-      <w:pPr>
-        <w:pStyle w:val="NoSpacing"/>
-        <w:ind w:left="576"/>
-      </w:pPr>
-      <w:r>
-        <w:rPr>
-          <w:rFonts w:ascii="Courier New" w:hAnsi="Courier New"/>
-          <w:color w:val="2E2E2E"/>
-          <w:sz w:val="18"/>
-        </w:rPr>
-        <w:t>Log guardado en: canvas_notion_sync.log</w:t>
-      </w:r>
-    </w:p>
-    <w:p/>
     <w:p>
       <w:pPr>
         <w:pStyle w:val="Heading1"/>
       </w:pPr>
       <w:r>
-        <w:t>12. Decisiones de Diseno</w:t>
+        <w:t>13. Reporte de Sincronización</w:t>
       </w:r>
     </w:p>
-    <w:tbl>
-      <w:tblPr>
-        <w:tblStyle w:val="TableGrid"/>
-        <w:tblW w:type="auto" w:w="0"/>
-        <w:tblLook w:firstColumn="1" w:firstRow="1" w:lastColumn="0" w:lastRow="0" w:noHBand="0" w:noVBand="1" w:val="04A0"/>
-      </w:tblPr>
-      <w:tblGrid>
-        <w:gridCol w:w="4320"/>
-        <w:gridCol w:w="4320"/>
-      </w:tblGrid>
-      <w:tr>
-        <w:tc>
-          <w:tcPr>
-            <w:tcW w:type="dxa" w:w="4320"/>
-          </w:tcPr>
-          <w:p>
-            <w:r>
-              <w:rPr>
-                <w:b/>
-              </w:rPr>
-              <w:t>Decision</w:t>
-            </w:r>
-          </w:p>
-        </w:tc>
-        <w:tc>
-          <w:tcPr>
-            <w:tcW w:type="dxa" w:w="4320"/>
-          </w:tcPr>
-          <w:p>
-            <w:r>
-              <w:rPr>
-                <w:b/>
-              </w:rPr>
-              <w:t>Justificacion</w:t>
-            </w:r>
-          </w:p>
-        </w:tc>
-      </w:tr>
-      <w:tr>
-        <w:tc>
-          <w:tcPr>
-            <w:tcW w:type="dxa" w:w="4320"/>
-          </w:tcPr>
-          <w:p>
-            <w:r>
-              <w:t>URL como Descripcion (titulo)</w:t>
-            </w:r>
-          </w:p>
-        </w:tc>
-        <w:tc>
-          <w:tcPr>
-            <w:tcW w:type="dxa" w:w="4320"/>
-          </w:tcPr>
-          <w:p>
-            <w:r>
-              <w:t>El campo Descripcion de Notion almacena la URL de Canvas (html_url). Esto permite identificar cada tarea de forma unica independientemente de su nombre, y ademas sirve como acceso directo a la tarea en Canvas.</w:t>
-            </w:r>
-          </w:p>
-        </w:tc>
-      </w:tr>
-      <w:tr>
-        <w:tc>
-          <w:tcPr>
-            <w:tcW w:type="dxa" w:w="4320"/>
-          </w:tcPr>
-          <w:p>
-            <w:r>
-              <w:t>Deduplicacion por URL</w:t>
-            </w:r>
-          </w:p>
-        </w:tc>
-        <w:tc>
-          <w:tcPr>
-            <w:tcW w:type="dxa" w:w="4320"/>
-          </w:tcPr>
-          <w:p>
-            <w:r>
-              <w:t>La URL de Canvas es un identificador unico y estable por tarea. Es mas confiable que el nombre, que puede repetirse entre cursos distintos.</w:t>
-            </w:r>
-          </w:p>
-        </w:tc>
-      </w:tr>
-      <w:tr>
-        <w:tc>
-          <w:tcPr>
-            <w:tcW w:type="dxa" w:w="4320"/>
-          </w:tcPr>
-          <w:p>
-            <w:r>
-              <w:t>Filtro temporal semanal</w:t>
-            </w:r>
-          </w:p>
-        </w:tc>
-        <w:tc>
-          <w:tcPr>
-            <w:tcW w:type="dxa" w:w="4320"/>
-          </w:tcPr>
-          <w:p>
-            <w:r>
-              <w:t>Solo se sincronizan tareas con due_at entre hoy y el domingo de la semana en curso (hora Colombia). Evita importar tareas pasadas o futuras irrelevantes.</w:t>
-            </w:r>
-          </w:p>
-        </w:tc>
-      </w:tr>
-      <w:tr>
-        <w:tc>
-          <w:tcPr>
-            <w:tcW w:type="dxa" w:w="4320"/>
-          </w:tcPr>
-          <w:p>
-            <w:r>
-              <w:t>Timezone Colombia (UTC-5)</w:t>
-            </w:r>
-          </w:p>
-        </w:tc>
-        <w:tc>
-          <w:tcPr>
-            <w:tcW w:type="dxa" w:w="4320"/>
-          </w:tcPr>
-          <w:p>
-            <w:r>
-              <w:t>Toda la logica temporal opera en UTC-5 fijo usando datetime.timezone. No se usa pytz para mantener las dependencias minimas.</w:t>
-            </w:r>
-          </w:p>
-        </w:tc>
-      </w:tr>
-      <w:tr>
-        <w:tc>
-          <w:tcPr>
-            <w:tcW w:type="dxa" w:w="4320"/>
-          </w:tcPr>
-          <w:p>
-            <w:r>
-              <w:t>Throttling Notion (0.35s)</w:t>
-            </w:r>
-          </w:p>
-        </w:tc>
-        <w:tc>
-          <w:tcPr>
-            <w:tcW w:type="dxa" w:w="4320"/>
-          </w:tcPr>
-          <w:p>
-            <w:r>
-              <w:t>Mantiene el rate de requests bajo el limite de la API de Notion (~3 req/s) sin necesidad de librerias adicionales.</w:t>
-            </w:r>
-          </w:p>
-        </w:tc>
-      </w:tr>
-      <w:tr>
-        <w:tc>
-          <w:tcPr>
-            <w:tcW w:type="dxa" w:w="4320"/>
-          </w:tcPr>
-          <w:p>
-            <w:r>
-              <w:t>Campo URL reservado para uso manual</w:t>
-            </w:r>
-          </w:p>
-        </w:tc>
-        <w:tc>
-          <w:tcPr>
-            <w:tcW w:type="dxa" w:w="4320"/>
-          </w:tcPr>
-          <w:p>
-            <w:r>
-              <w:t>El campo URL de la tabla Notion no es escrito por el script. El usuario lo usa para pegar links a documentos propios relacionados con cada tarea.</w:t>
-            </w:r>
-          </w:p>
-        </w:tc>
-      </w:tr>
-      <w:tr>
-        <w:tc>
-          <w:tcPr>
-            <w:tcW w:type="dxa" w:w="4320"/>
-          </w:tcPr>
-          <w:p>
-            <w:r>
-              <w:t>Sin frameworks adicionales</w:t>
-            </w:r>
-          </w:p>
-        </w:tc>
-        <w:tc>
-          <w:tcPr>
-            <w:tcW w:type="dxa" w:w="4320"/>
-          </w:tcPr>
-          <w:p>
-            <w:r>
-              <w:t>Solo requests y python-dotenv como dependencias externas. Mantiene el proyecto simple, portable y facil de mantener.</w:t>
-            </w:r>
-          </w:p>
-        </w:tc>
-      </w:tr>
-    </w:tbl>
+    <w:p>
+      <w:r>
+        <w:t>Al finalizar cada ejecución se imprime un resumen en consola y se guarda en canvas_notion_sync.log:</w:t>
+      </w:r>
+    </w:p>
+    <w:p>
+      <w:pPr/>
+      <w:r>
+        <w:rPr>
+          <w:rFonts w:ascii="Courier New" w:hAnsi="Courier New"/>
+          <w:color w:val="2E75B6"/>
+          <w:sz w:val="18"/>
+        </w:rPr>
+        <w:t>--- Reporte de sincronización ---</w:t>
+        <w:br/>
+        <w:t xml:space="preserve">  Tareas creadas:  3</w:t>
+        <w:br/>
+        <w:t xml:space="preserve">  Tareas saltadas: 12</w:t>
+        <w:br/>
+        <w:t xml:space="preserve">  Errores:         0</w:t>
+        <w:br/>
+        <w:t xml:space="preserve">  Cursos sin mapeo (1):</w:t>
+        <w:br/>
+        <w:t xml:space="preserve">    - ELECTIVA LIBRE</w:t>
+      </w:r>
+    </w:p>
+    <w:p>
+      <w:pPr>
+        <w:pStyle w:val="Heading1"/>
+      </w:pPr>
+      <w:r>
+        <w:t>14. Ejecución Local</w:t>
+      </w:r>
+    </w:p>
+    <w:p>
+      <w:r>
+        <w:t>Para correr el proyecto localmente:</w:t>
+      </w:r>
+    </w:p>
+    <w:p>
+      <w:pPr>
+        <w:pStyle w:val="ListBullet"/>
+      </w:pPr>
+      <w:r>
+        <w:t>1. Clonar el repositorio.</w:t>
+      </w:r>
+    </w:p>
+    <w:p>
+      <w:pPr>
+        <w:pStyle w:val="ListBullet"/>
+      </w:pPr>
+      <w:r>
+        <w:t>2. Crear el archivo .env con las credenciales reales.</w:t>
+      </w:r>
+    </w:p>
+    <w:p>
+      <w:pPr>
+        <w:pStyle w:val="ListBullet"/>
+      </w:pPr>
+      <w:r>
+        <w:t>3. Instalar dependencias: pip install -r requirements.txt</w:t>
+      </w:r>
+    </w:p>
+    <w:p>
+      <w:pPr>
+        <w:pStyle w:val="ListBullet"/>
+      </w:pPr>
+      <w:r>
+        <w:t>4. Ejecutar: python main.py</w:t>
+      </w:r>
+    </w:p>
     <w:sectPr>
       <w:pgSz w:w="12240" w:h="15840"/>
       <w:pgMar w:top="1440" w:right="1800" w:bottom="1440" w:left="1800" w:header="720" w:footer="720" w:gutter="0"/>
@@ -3236,10 +1016,6 @@
     <w:name w:val="Normal"/>
     <w:qFormat/>
     <w:rsid w:val="00FC693F"/>
-    <w:rPr>
-      <w:rFonts w:ascii="Calibri" w:hAnsi="Calibri"/>
-      <w:sz w:val="22"/>
-    </w:rPr>
   </w:style>
   <w:style w:type="paragraph" w:styleId="Header">
     <w:name w:val="header"/>

</xml_diff>